<commit_message>
content: the biased-AI lab is taught by demonstration — four worked answers, a model answer with its below-standard contrast, three pupils' work marked, and a sixty-second marking routine (both editions)
</commit_message>
<xml_diff>
--- a/public/files/biased-ai-lab-repair.docx
+++ b/public/files/biased-ai-lab-repair.docx
@@ -12,9 +12,6 @@
     </w:p>
     <w:p>
       <w:r>
-        <w:rPr>
-          <w:i/>
-        </w:rPr>
         <w:t>全部人物、學校與資料均為虛構；本實驗在紙上完成，毋須任何 AI 工具。</w:t>
       </w:r>
     </w:p>
@@ -56,23 +53,24 @@
         <w:tblLook w:firstColumn="1" w:firstRow="1" w:lastColumn="0" w:lastRow="0" w:noHBand="0" w:noVBand="1" w:val="04A0"/>
       </w:tblPr>
       <w:tblGrid>
-        <w:gridCol w:w="1569"/>
-        <w:gridCol w:w="1569"/>
-        <w:gridCol w:w="1569"/>
-        <w:gridCol w:w="1569"/>
-        <w:gridCol w:w="1569"/>
-        <w:gridCol w:w="1569"/>
+        <w:gridCol w:w="1606"/>
+        <w:gridCol w:w="1606"/>
+        <w:gridCol w:w="1606"/>
+        <w:gridCol w:w="1606"/>
+        <w:gridCol w:w="1606"/>
+        <w:gridCol w:w="1606"/>
       </w:tblGrid>
       <w:tr>
         <w:tc>
           <w:tcPr>
-            <w:tcW w:type="dxa" w:w="1569"/>
+            <w:tcW w:type="dxa" w:w="1606"/>
           </w:tcPr>
           <w:p>
             <w:r/>
             <w:r>
               <w:rPr>
                 <w:b/>
+                <w:sz w:val="19"/>
               </w:rPr>
               <w:t>舊生</w:t>
             </w:r>
@@ -80,13 +78,14 @@
         </w:tc>
         <w:tc>
           <w:tcPr>
-            <w:tcW w:type="dxa" w:w="1569"/>
+            <w:tcW w:type="dxa" w:w="1606"/>
           </w:tcPr>
           <w:p>
             <w:r/>
             <w:r>
               <w:rPr>
                 <w:b/>
+                <w:sz w:val="19"/>
               </w:rPr>
               <w:t>班別</w:t>
             </w:r>
@@ -94,13 +93,14 @@
         </w:tc>
         <w:tc>
           <w:tcPr>
-            <w:tcW w:type="dxa" w:w="1569"/>
+            <w:tcW w:type="dxa" w:w="1606"/>
           </w:tcPr>
           <w:p>
             <w:r/>
             <w:r>
               <w:rPr>
                 <w:b/>
+                <w:sz w:val="19"/>
               </w:rPr>
               <w:t>家中電腦（學校紀錄）</w:t>
             </w:r>
@@ -108,13 +108,14 @@
         </w:tc>
         <w:tc>
           <w:tcPr>
-            <w:tcW w:type="dxa" w:w="1569"/>
+            <w:tcW w:type="dxa" w:w="1606"/>
           </w:tcPr>
           <w:p>
             <w:r/>
             <w:r>
               <w:rPr>
                 <w:b/>
+                <w:sz w:val="19"/>
               </w:rPr>
               <w:t>出席節數</w:t>
             </w:r>
@@ -122,13 +123,14 @@
         </w:tc>
         <w:tc>
           <w:tcPr>
-            <w:tcW w:type="dxa" w:w="1569"/>
+            <w:tcW w:type="dxa" w:w="1606"/>
           </w:tcPr>
           <w:p>
             <w:r/>
             <w:r>
               <w:rPr>
                 <w:b/>
+                <w:sz w:val="19"/>
               </w:rPr>
               <w:t>有人接放學（學校紀錄）</w:t>
             </w:r>
@@ -136,13 +138,14 @@
         </w:tc>
         <w:tc>
           <w:tcPr>
-            <w:tcW w:type="dxa" w:w="1569"/>
+            <w:tcW w:type="dxa" w:w="1606"/>
           </w:tcPr>
           <w:p>
             <w:r/>
             <w:r>
               <w:rPr>
                 <w:b/>
+                <w:sz w:val="19"/>
               </w:rPr>
               <w:t>結果：留低並享受</w:t>
             </w:r>
@@ -152,60 +155,84 @@
       <w:tr>
         <w:tc>
           <w:tcPr>
-            <w:tcW w:type="dxa" w:w="1569"/>
+            <w:tcW w:type="dxa" w:w="1606"/>
           </w:tcPr>
           <w:p>
+            <w:r/>
             <w:r>
+              <w:rPr>
+                <w:sz w:val="19"/>
+              </w:rPr>
               <w:t>A</w:t>
             </w:r>
           </w:p>
         </w:tc>
         <w:tc>
           <w:tcPr>
-            <w:tcW w:type="dxa" w:w="1569"/>
+            <w:tcW w:type="dxa" w:w="1606"/>
           </w:tcPr>
           <w:p>
+            <w:r/>
             <w:r>
+              <w:rPr>
+                <w:sz w:val="19"/>
+              </w:rPr>
               <w:t>1A</w:t>
             </w:r>
           </w:p>
         </w:tc>
         <w:tc>
           <w:tcPr>
-            <w:tcW w:type="dxa" w:w="1569"/>
+            <w:tcW w:type="dxa" w:w="1606"/>
           </w:tcPr>
           <w:p>
+            <w:r/>
             <w:r>
+              <w:rPr>
+                <w:sz w:val="19"/>
+              </w:rPr>
               <w:t>有</w:t>
             </w:r>
           </w:p>
         </w:tc>
         <w:tc>
           <w:tcPr>
-            <w:tcW w:type="dxa" w:w="1569"/>
+            <w:tcW w:type="dxa" w:w="1606"/>
           </w:tcPr>
           <w:p>
+            <w:r/>
             <w:r>
+              <w:rPr>
+                <w:sz w:val="19"/>
+              </w:rPr>
               <w:t>3</w:t>
             </w:r>
           </w:p>
         </w:tc>
         <w:tc>
           <w:tcPr>
-            <w:tcW w:type="dxa" w:w="1569"/>
+            <w:tcW w:type="dxa" w:w="1606"/>
           </w:tcPr>
           <w:p>
+            <w:r/>
             <w:r>
+              <w:rPr>
+                <w:sz w:val="19"/>
+              </w:rPr>
               <w:t>有</w:t>
             </w:r>
           </w:p>
         </w:tc>
         <w:tc>
           <w:tcPr>
-            <w:tcW w:type="dxa" w:w="1569"/>
+            <w:tcW w:type="dxa" w:w="1606"/>
           </w:tcPr>
           <w:p>
+            <w:r/>
             <w:r>
+              <w:rPr>
+                <w:sz w:val="19"/>
+              </w:rPr>
               <w:t>是</w:t>
             </w:r>
           </w:p>
@@ -214,60 +241,84 @@
       <w:tr>
         <w:tc>
           <w:tcPr>
-            <w:tcW w:type="dxa" w:w="1569"/>
+            <w:tcW w:type="dxa" w:w="1606"/>
           </w:tcPr>
           <w:p>
+            <w:r/>
             <w:r>
+              <w:rPr>
+                <w:sz w:val="19"/>
+              </w:rPr>
               <w:t>B</w:t>
             </w:r>
           </w:p>
         </w:tc>
         <w:tc>
           <w:tcPr>
-            <w:tcW w:type="dxa" w:w="1569"/>
+            <w:tcW w:type="dxa" w:w="1606"/>
           </w:tcPr>
           <w:p>
+            <w:r/>
             <w:r>
+              <w:rPr>
+                <w:sz w:val="19"/>
+              </w:rPr>
               <w:t>1A</w:t>
             </w:r>
           </w:p>
         </w:tc>
         <w:tc>
           <w:tcPr>
-            <w:tcW w:type="dxa" w:w="1569"/>
+            <w:tcW w:type="dxa" w:w="1606"/>
           </w:tcPr>
           <w:p>
+            <w:r/>
             <w:r>
+              <w:rPr>
+                <w:sz w:val="19"/>
+              </w:rPr>
               <w:t>有</w:t>
             </w:r>
           </w:p>
         </w:tc>
         <w:tc>
           <w:tcPr>
-            <w:tcW w:type="dxa" w:w="1569"/>
+            <w:tcW w:type="dxa" w:w="1606"/>
           </w:tcPr>
           <w:p>
+            <w:r/>
             <w:r>
+              <w:rPr>
+                <w:sz w:val="19"/>
+              </w:rPr>
               <w:t>2</w:t>
             </w:r>
           </w:p>
         </w:tc>
         <w:tc>
           <w:tcPr>
-            <w:tcW w:type="dxa" w:w="1569"/>
+            <w:tcW w:type="dxa" w:w="1606"/>
           </w:tcPr>
           <w:p>
+            <w:r/>
             <w:r>
+              <w:rPr>
+                <w:sz w:val="19"/>
+              </w:rPr>
               <w:t>有</w:t>
             </w:r>
           </w:p>
         </w:tc>
         <w:tc>
           <w:tcPr>
-            <w:tcW w:type="dxa" w:w="1569"/>
+            <w:tcW w:type="dxa" w:w="1606"/>
           </w:tcPr>
           <w:p>
+            <w:r/>
             <w:r>
+              <w:rPr>
+                <w:sz w:val="19"/>
+              </w:rPr>
               <w:t>是</w:t>
             </w:r>
           </w:p>
@@ -276,60 +327,84 @@
       <w:tr>
         <w:tc>
           <w:tcPr>
-            <w:tcW w:type="dxa" w:w="1569"/>
+            <w:tcW w:type="dxa" w:w="1606"/>
           </w:tcPr>
           <w:p>
+            <w:r/>
             <w:r>
+              <w:rPr>
+                <w:sz w:val="19"/>
+              </w:rPr>
               <w:t>C</w:t>
             </w:r>
           </w:p>
         </w:tc>
         <w:tc>
           <w:tcPr>
-            <w:tcW w:type="dxa" w:w="1569"/>
+            <w:tcW w:type="dxa" w:w="1606"/>
           </w:tcPr>
           <w:p>
+            <w:r/>
             <w:r>
+              <w:rPr>
+                <w:sz w:val="19"/>
+              </w:rPr>
               <w:t>1B</w:t>
             </w:r>
           </w:p>
         </w:tc>
         <w:tc>
           <w:tcPr>
-            <w:tcW w:type="dxa" w:w="1569"/>
+            <w:tcW w:type="dxa" w:w="1606"/>
           </w:tcPr>
           <w:p>
+            <w:r/>
             <w:r>
+              <w:rPr>
+                <w:sz w:val="19"/>
+              </w:rPr>
               <w:t>有</w:t>
             </w:r>
           </w:p>
         </w:tc>
         <w:tc>
           <w:tcPr>
-            <w:tcW w:type="dxa" w:w="1569"/>
+            <w:tcW w:type="dxa" w:w="1606"/>
           </w:tcPr>
           <w:p>
+            <w:r/>
             <w:r>
+              <w:rPr>
+                <w:sz w:val="19"/>
+              </w:rPr>
               <w:t>3</w:t>
             </w:r>
           </w:p>
         </w:tc>
         <w:tc>
           <w:tcPr>
-            <w:tcW w:type="dxa" w:w="1569"/>
+            <w:tcW w:type="dxa" w:w="1606"/>
           </w:tcPr>
           <w:p>
+            <w:r/>
             <w:r>
+              <w:rPr>
+                <w:sz w:val="19"/>
+              </w:rPr>
               <w:t>無</w:t>
             </w:r>
           </w:p>
         </w:tc>
         <w:tc>
           <w:tcPr>
-            <w:tcW w:type="dxa" w:w="1569"/>
+            <w:tcW w:type="dxa" w:w="1606"/>
           </w:tcPr>
           <w:p>
+            <w:r/>
             <w:r>
+              <w:rPr>
+                <w:sz w:val="19"/>
+              </w:rPr>
               <w:t>是</w:t>
             </w:r>
           </w:p>
@@ -338,60 +413,84 @@
       <w:tr>
         <w:tc>
           <w:tcPr>
-            <w:tcW w:type="dxa" w:w="1569"/>
+            <w:tcW w:type="dxa" w:w="1606"/>
           </w:tcPr>
           <w:p>
+            <w:r/>
             <w:r>
+              <w:rPr>
+                <w:sz w:val="19"/>
+              </w:rPr>
               <w:t>D</w:t>
             </w:r>
           </w:p>
         </w:tc>
         <w:tc>
           <w:tcPr>
-            <w:tcW w:type="dxa" w:w="1569"/>
+            <w:tcW w:type="dxa" w:w="1606"/>
           </w:tcPr>
           <w:p>
+            <w:r/>
             <w:r>
+              <w:rPr>
+                <w:sz w:val="19"/>
+              </w:rPr>
               <w:t>1B</w:t>
             </w:r>
           </w:p>
         </w:tc>
         <w:tc>
           <w:tcPr>
-            <w:tcW w:type="dxa" w:w="1569"/>
+            <w:tcW w:type="dxa" w:w="1606"/>
           </w:tcPr>
           <w:p>
+            <w:r/>
             <w:r>
+              <w:rPr>
+                <w:sz w:val="19"/>
+              </w:rPr>
               <w:t>有</w:t>
             </w:r>
           </w:p>
         </w:tc>
         <w:tc>
           <w:tcPr>
-            <w:tcW w:type="dxa" w:w="1569"/>
+            <w:tcW w:type="dxa" w:w="1606"/>
           </w:tcPr>
           <w:p>
+            <w:r/>
             <w:r>
+              <w:rPr>
+                <w:sz w:val="19"/>
+              </w:rPr>
               <w:t>1</w:t>
             </w:r>
           </w:p>
         </w:tc>
         <w:tc>
           <w:tcPr>
-            <w:tcW w:type="dxa" w:w="1569"/>
+            <w:tcW w:type="dxa" w:w="1606"/>
           </w:tcPr>
           <w:p>
+            <w:r/>
             <w:r>
+              <w:rPr>
+                <w:sz w:val="19"/>
+              </w:rPr>
               <w:t>有</w:t>
             </w:r>
           </w:p>
         </w:tc>
         <w:tc>
           <w:tcPr>
-            <w:tcW w:type="dxa" w:w="1569"/>
+            <w:tcW w:type="dxa" w:w="1606"/>
           </w:tcPr>
           <w:p>
+            <w:r/>
             <w:r>
+              <w:rPr>
+                <w:sz w:val="19"/>
+              </w:rPr>
               <w:t>是</w:t>
             </w:r>
           </w:p>
@@ -400,60 +499,84 @@
       <w:tr>
         <w:tc>
           <w:tcPr>
-            <w:tcW w:type="dxa" w:w="1569"/>
+            <w:tcW w:type="dxa" w:w="1606"/>
           </w:tcPr>
           <w:p>
+            <w:r/>
             <w:r>
+              <w:rPr>
+                <w:sz w:val="19"/>
+              </w:rPr>
               <w:t>E</w:t>
             </w:r>
           </w:p>
         </w:tc>
         <w:tc>
           <w:tcPr>
-            <w:tcW w:type="dxa" w:w="1569"/>
+            <w:tcW w:type="dxa" w:w="1606"/>
           </w:tcPr>
           <w:p>
+            <w:r/>
             <w:r>
+              <w:rPr>
+                <w:sz w:val="19"/>
+              </w:rPr>
               <w:t>1A</w:t>
             </w:r>
           </w:p>
         </w:tc>
         <w:tc>
           <w:tcPr>
-            <w:tcW w:type="dxa" w:w="1569"/>
+            <w:tcW w:type="dxa" w:w="1606"/>
           </w:tcPr>
           <w:p>
+            <w:r/>
             <w:r>
+              <w:rPr>
+                <w:sz w:val="19"/>
+              </w:rPr>
               <w:t>有</w:t>
             </w:r>
           </w:p>
         </w:tc>
         <w:tc>
           <w:tcPr>
-            <w:tcW w:type="dxa" w:w="1569"/>
+            <w:tcW w:type="dxa" w:w="1606"/>
           </w:tcPr>
           <w:p>
+            <w:r/>
             <w:r>
+              <w:rPr>
+                <w:sz w:val="19"/>
+              </w:rPr>
               <w:t>2</w:t>
             </w:r>
           </w:p>
         </w:tc>
         <w:tc>
           <w:tcPr>
-            <w:tcW w:type="dxa" w:w="1569"/>
+            <w:tcW w:type="dxa" w:w="1606"/>
           </w:tcPr>
           <w:p>
+            <w:r/>
             <w:r>
+              <w:rPr>
+                <w:sz w:val="19"/>
+              </w:rPr>
               <w:t>有</w:t>
             </w:r>
           </w:p>
         </w:tc>
         <w:tc>
           <w:tcPr>
-            <w:tcW w:type="dxa" w:w="1569"/>
+            <w:tcW w:type="dxa" w:w="1606"/>
           </w:tcPr>
           <w:p>
+            <w:r/>
             <w:r>
+              <w:rPr>
+                <w:sz w:val="19"/>
+              </w:rPr>
               <w:t>是</w:t>
             </w:r>
           </w:p>
@@ -462,60 +585,84 @@
       <w:tr>
         <w:tc>
           <w:tcPr>
-            <w:tcW w:type="dxa" w:w="1569"/>
+            <w:tcW w:type="dxa" w:w="1606"/>
           </w:tcPr>
           <w:p>
+            <w:r/>
             <w:r>
+              <w:rPr>
+                <w:sz w:val="19"/>
+              </w:rPr>
               <w:t>F</w:t>
             </w:r>
           </w:p>
         </w:tc>
         <w:tc>
           <w:tcPr>
-            <w:tcW w:type="dxa" w:w="1569"/>
+            <w:tcW w:type="dxa" w:w="1606"/>
           </w:tcPr>
           <w:p>
+            <w:r/>
             <w:r>
+              <w:rPr>
+                <w:sz w:val="19"/>
+              </w:rPr>
               <w:t>1C</w:t>
             </w:r>
           </w:p>
         </w:tc>
         <w:tc>
           <w:tcPr>
-            <w:tcW w:type="dxa" w:w="1569"/>
+            <w:tcW w:type="dxa" w:w="1606"/>
           </w:tcPr>
           <w:p>
+            <w:r/>
             <w:r>
+              <w:rPr>
+                <w:sz w:val="19"/>
+              </w:rPr>
               <w:t>無</w:t>
             </w:r>
           </w:p>
         </w:tc>
         <w:tc>
           <w:tcPr>
-            <w:tcW w:type="dxa" w:w="1569"/>
+            <w:tcW w:type="dxa" w:w="1606"/>
           </w:tcPr>
           <w:p>
+            <w:r/>
             <w:r>
+              <w:rPr>
+                <w:sz w:val="19"/>
+              </w:rPr>
               <w:t>3</w:t>
             </w:r>
           </w:p>
         </w:tc>
         <w:tc>
           <w:tcPr>
-            <w:tcW w:type="dxa" w:w="1569"/>
+            <w:tcW w:type="dxa" w:w="1606"/>
           </w:tcPr>
           <w:p>
+            <w:r/>
             <w:r>
+              <w:rPr>
+                <w:sz w:val="19"/>
+              </w:rPr>
               <w:t>有</w:t>
             </w:r>
           </w:p>
         </w:tc>
         <w:tc>
           <w:tcPr>
-            <w:tcW w:type="dxa" w:w="1569"/>
+            <w:tcW w:type="dxa" w:w="1606"/>
           </w:tcPr>
           <w:p>
+            <w:r/>
             <w:r>
+              <w:rPr>
+                <w:sz w:val="19"/>
+              </w:rPr>
               <w:t>否</w:t>
             </w:r>
           </w:p>
@@ -524,60 +671,84 @@
       <w:tr>
         <w:tc>
           <w:tcPr>
-            <w:tcW w:type="dxa" w:w="1569"/>
+            <w:tcW w:type="dxa" w:w="1606"/>
           </w:tcPr>
           <w:p>
+            <w:r/>
             <w:r>
+              <w:rPr>
+                <w:sz w:val="19"/>
+              </w:rPr>
               <w:t>G</w:t>
             </w:r>
           </w:p>
         </w:tc>
         <w:tc>
           <w:tcPr>
-            <w:tcW w:type="dxa" w:w="1569"/>
+            <w:tcW w:type="dxa" w:w="1606"/>
           </w:tcPr>
           <w:p>
+            <w:r/>
             <w:r>
+              <w:rPr>
+                <w:sz w:val="19"/>
+              </w:rPr>
               <w:t>1B</w:t>
             </w:r>
           </w:p>
         </w:tc>
         <w:tc>
           <w:tcPr>
-            <w:tcW w:type="dxa" w:w="1569"/>
+            <w:tcW w:type="dxa" w:w="1606"/>
           </w:tcPr>
           <w:p>
+            <w:r/>
             <w:r>
+              <w:rPr>
+                <w:sz w:val="19"/>
+              </w:rPr>
               <w:t>無</w:t>
             </w:r>
           </w:p>
         </w:tc>
         <w:tc>
           <w:tcPr>
-            <w:tcW w:type="dxa" w:w="1569"/>
+            <w:tcW w:type="dxa" w:w="1606"/>
           </w:tcPr>
           <w:p>
+            <w:r/>
             <w:r>
+              <w:rPr>
+                <w:sz w:val="19"/>
+              </w:rPr>
               <w:t>3</w:t>
             </w:r>
           </w:p>
         </w:tc>
         <w:tc>
           <w:tcPr>
-            <w:tcW w:type="dxa" w:w="1569"/>
+            <w:tcW w:type="dxa" w:w="1606"/>
           </w:tcPr>
           <w:p>
+            <w:r/>
             <w:r>
+              <w:rPr>
+                <w:sz w:val="19"/>
+              </w:rPr>
               <w:t>無</w:t>
             </w:r>
           </w:p>
         </w:tc>
         <w:tc>
           <w:tcPr>
-            <w:tcW w:type="dxa" w:w="1569"/>
+            <w:tcW w:type="dxa" w:w="1606"/>
           </w:tcPr>
           <w:p>
+            <w:r/>
             <w:r>
+              <w:rPr>
+                <w:sz w:val="19"/>
+              </w:rPr>
               <w:t>是</w:t>
             </w:r>
           </w:p>
@@ -586,67 +757,90 @@
       <w:tr>
         <w:tc>
           <w:tcPr>
-            <w:tcW w:type="dxa" w:w="1569"/>
+            <w:tcW w:type="dxa" w:w="1606"/>
           </w:tcPr>
           <w:p>
+            <w:r/>
             <w:r>
+              <w:rPr>
+                <w:sz w:val="19"/>
+              </w:rPr>
               <w:t>H</w:t>
             </w:r>
           </w:p>
         </w:tc>
         <w:tc>
           <w:tcPr>
-            <w:tcW w:type="dxa" w:w="1569"/>
+            <w:tcW w:type="dxa" w:w="1606"/>
           </w:tcPr>
           <w:p>
+            <w:r/>
             <w:r>
+              <w:rPr>
+                <w:sz w:val="19"/>
+              </w:rPr>
               <w:t>1A</w:t>
             </w:r>
           </w:p>
         </w:tc>
         <w:tc>
           <w:tcPr>
-            <w:tcW w:type="dxa" w:w="1569"/>
+            <w:tcW w:type="dxa" w:w="1606"/>
           </w:tcPr>
           <w:p>
+            <w:r/>
             <w:r>
+              <w:rPr>
+                <w:sz w:val="19"/>
+              </w:rPr>
               <w:t>無</w:t>
             </w:r>
           </w:p>
         </w:tc>
         <w:tc>
           <w:tcPr>
-            <w:tcW w:type="dxa" w:w="1569"/>
+            <w:tcW w:type="dxa" w:w="1606"/>
           </w:tcPr>
           <w:p>
+            <w:r/>
             <w:r>
+              <w:rPr>
+                <w:sz w:val="19"/>
+              </w:rPr>
               <w:t>0</w:t>
             </w:r>
           </w:p>
         </w:tc>
         <w:tc>
           <w:tcPr>
-            <w:tcW w:type="dxa" w:w="1569"/>
+            <w:tcW w:type="dxa" w:w="1606"/>
           </w:tcPr>
           <w:p>
+            <w:r/>
             <w:r>
+              <w:rPr>
+                <w:sz w:val="19"/>
+              </w:rPr>
               <w:t>無</w:t>
             </w:r>
           </w:p>
         </w:tc>
         <w:tc>
           <w:tcPr>
-            <w:tcW w:type="dxa" w:w="1569"/>
+            <w:tcW w:type="dxa" w:w="1606"/>
           </w:tcPr>
           <w:p>
+            <w:r/>
             <w:r>
+              <w:rPr>
+                <w:sz w:val="19"/>
+              </w:rPr>
               <w:t>否</w:t>
             </w:r>
           </w:p>
         </w:tc>
       </w:tr>
     </w:tbl>
-    <w:p/>
     <w:p>
       <w:pPr>
         <w:pStyle w:val="Heading2"/>
@@ -684,7 +878,11 @@
         <w:t>第 3 行：否則 → 不推薦</w:t>
       </w:r>
     </w:p>
-    <w:p/>
+    <w:p>
+      <w:r>
+        <w:br w:type="page"/>
+      </w:r>
+    </w:p>
     <w:p>
       <w:pPr>
         <w:pStyle w:val="Heading2"/>
@@ -695,50 +893,236 @@
     </w:p>
     <w:p>
       <w:r>
-        <w:t>用下面的檢查清單，找出資料的問題（提示：數一數，不要憑感覺）。</w:t>
+        <w:t>用下面的檢查清單，找出資料的問題（提示：數一數，不要憑感覺）。先在「我的數目」填一個數，再寫一句答案——沒有數目的答案當作未完成。</w:t>
       </w:r>
     </w:p>
-    <w:p>
-      <w:pPr>
-        <w:pStyle w:val="ListBullet"/>
-      </w:pPr>
-      <w:r>
-        <w:t>□ 哪一個屬性「揹起」了決定？（結果是「是」的舊生中，有多少人有電腦？）</w:t>
-      </w:r>
-    </w:p>
-    <w:p>
-      <w:pPr>
-        <w:pStyle w:val="ListBullet"/>
-      </w:pPr>
-      <w:r>
-        <w:t>□ 哪一類學生沒有被代表？（八個舊生分別來自哪些班？有哪一班完全沒有紀錄？）</w:t>
-      </w:r>
-    </w:p>
-    <w:p>
-      <w:pPr>
-        <w:pStyle w:val="ListBullet"/>
-      </w:pPr>
-      <w:r>
-        <w:t>□ 資料量度的是甚麼？遺漏了甚麼？</w:t>
-      </w:r>
-    </w:p>
-    <w:p>
-      <w:pPr>
-        <w:pStyle w:val="ListBullet"/>
-      </w:pPr>
-      <w:r>
-        <w:t>□ 這是資料問題，還是學生問題？為甚麼？</w:t>
-      </w:r>
-    </w:p>
-    <w:p>
-      <w:r>
-        <w:t>我的答案：</w:t>
-      </w:r>
-    </w:p>
-    <w:p/>
-    <w:p/>
-    <w:p/>
-    <w:p/>
+    <w:tbl>
+      <w:tblPr>
+        <w:tblStyle w:val="TableGrid"/>
+        <w:tblW w:type="auto" w:w="0"/>
+        <w:tblLook w:firstColumn="1" w:firstRow="1" w:lastColumn="0" w:lastRow="0" w:noHBand="0" w:noVBand="1" w:val="04A0"/>
+      </w:tblPr>
+      <w:tblGrid>
+        <w:gridCol w:w="3213"/>
+        <w:gridCol w:w="3213"/>
+        <w:gridCol w:w="3213"/>
+      </w:tblGrid>
+      <w:tr>
+        <w:tc>
+          <w:tcPr>
+            <w:tcW w:type="dxa" w:w="4876"/>
+          </w:tcPr>
+          <w:p>
+            <w:r/>
+            <w:r>
+              <w:rPr>
+                <w:b/>
+                <w:sz w:val="19"/>
+              </w:rPr>
+              <w:t>檢查問題</w:t>
+            </w:r>
+          </w:p>
+        </w:tc>
+        <w:tc>
+          <w:tcPr>
+            <w:tcW w:type="dxa" w:w="1474"/>
+          </w:tcPr>
+          <w:p>
+            <w:r/>
+            <w:r>
+              <w:rPr>
+                <w:b/>
+                <w:sz w:val="19"/>
+              </w:rPr>
+              <w:t>我的數目</w:t>
+            </w:r>
+          </w:p>
+        </w:tc>
+        <w:tc>
+          <w:tcPr>
+            <w:tcW w:type="dxa" w:w="3288"/>
+          </w:tcPr>
+          <w:p>
+            <w:r/>
+            <w:r>
+              <w:rPr>
+                <w:b/>
+                <w:sz w:val="19"/>
+              </w:rPr>
+              <w:t>我寫下的答案</w:t>
+            </w:r>
+          </w:p>
+        </w:tc>
+      </w:tr>
+      <w:tr>
+        <w:tc>
+          <w:tcPr>
+            <w:tcW w:type="dxa" w:w="4876"/>
+          </w:tcPr>
+          <w:p>
+            <w:r/>
+            <w:r>
+              <w:rPr>
+                <w:sz w:val="19"/>
+              </w:rPr>
+              <w:t>1. 哪一個屬性「揹起」了決定？（結果是「是」的舊生中，有多少人有電腦？）</w:t>
+            </w:r>
+          </w:p>
+        </w:tc>
+        <w:tc>
+          <w:tcPr>
+            <w:tcW w:type="dxa" w:w="1474"/>
+          </w:tcPr>
+          <w:p>
+            <w:r/>
+            <w:r>
+              <w:rPr>
+                <w:sz w:val="19"/>
+              </w:rPr>
+            </w:r>
+          </w:p>
+        </w:tc>
+        <w:tc>
+          <w:tcPr>
+            <w:tcW w:type="dxa" w:w="3288"/>
+          </w:tcPr>
+          <w:p>
+            <w:r/>
+            <w:r>
+              <w:rPr>
+                <w:sz w:val="19"/>
+              </w:rPr>
+            </w:r>
+          </w:p>
+        </w:tc>
+      </w:tr>
+      <w:tr>
+        <w:tc>
+          <w:tcPr>
+            <w:tcW w:type="dxa" w:w="4876"/>
+          </w:tcPr>
+          <w:p>
+            <w:r/>
+            <w:r>
+              <w:rPr>
+                <w:sz w:val="19"/>
+              </w:rPr>
+              <w:t>2. 哪一類學生沒有被代表？（八個舊生分別來自哪些班？有哪一班完全沒有紀錄？）</w:t>
+            </w:r>
+          </w:p>
+        </w:tc>
+        <w:tc>
+          <w:tcPr>
+            <w:tcW w:type="dxa" w:w="1474"/>
+          </w:tcPr>
+          <w:p>
+            <w:r/>
+            <w:r>
+              <w:rPr>
+                <w:sz w:val="19"/>
+              </w:rPr>
+            </w:r>
+          </w:p>
+        </w:tc>
+        <w:tc>
+          <w:tcPr>
+            <w:tcW w:type="dxa" w:w="3288"/>
+          </w:tcPr>
+          <w:p>
+            <w:r/>
+            <w:r>
+              <w:rPr>
+                <w:sz w:val="19"/>
+              </w:rPr>
+            </w:r>
+          </w:p>
+        </w:tc>
+      </w:tr>
+      <w:tr>
+        <w:tc>
+          <w:tcPr>
+            <w:tcW w:type="dxa" w:w="4876"/>
+          </w:tcPr>
+          <w:p>
+            <w:r/>
+            <w:r>
+              <w:rPr>
+                <w:sz w:val="19"/>
+              </w:rPr>
+              <w:t>3. 資料量度的是甚麼？遺漏了甚麼？</w:t>
+            </w:r>
+          </w:p>
+        </w:tc>
+        <w:tc>
+          <w:tcPr>
+            <w:tcW w:type="dxa" w:w="1474"/>
+          </w:tcPr>
+          <w:p>
+            <w:r/>
+            <w:r>
+              <w:rPr>
+                <w:sz w:val="19"/>
+              </w:rPr>
+            </w:r>
+          </w:p>
+        </w:tc>
+        <w:tc>
+          <w:tcPr>
+            <w:tcW w:type="dxa" w:w="3288"/>
+          </w:tcPr>
+          <w:p>
+            <w:r/>
+            <w:r>
+              <w:rPr>
+                <w:sz w:val="19"/>
+              </w:rPr>
+            </w:r>
+          </w:p>
+        </w:tc>
+      </w:tr>
+      <w:tr>
+        <w:tc>
+          <w:tcPr>
+            <w:tcW w:type="dxa" w:w="4876"/>
+          </w:tcPr>
+          <w:p>
+            <w:r/>
+            <w:r>
+              <w:rPr>
+                <w:sz w:val="19"/>
+              </w:rPr>
+              <w:t>4. 這是資料問題，還是學生問題？為甚麼？</w:t>
+            </w:r>
+          </w:p>
+        </w:tc>
+        <w:tc>
+          <w:tcPr>
+            <w:tcW w:type="dxa" w:w="1474"/>
+          </w:tcPr>
+          <w:p>
+            <w:r/>
+            <w:r>
+              <w:rPr>
+                <w:sz w:val="19"/>
+              </w:rPr>
+            </w:r>
+          </w:p>
+        </w:tc>
+        <w:tc>
+          <w:tcPr>
+            <w:tcW w:type="dxa" w:w="3288"/>
+          </w:tcPr>
+          <w:p>
+            <w:r/>
+            <w:r>
+              <w:rPr>
+                <w:sz w:val="19"/>
+              </w:rPr>
+            </w:r>
+          </w:p>
+        </w:tc>
+      </w:tr>
+    </w:tbl>
     <w:p>
       <w:pPr>
         <w:pStyle w:val="Heading2"/>
@@ -775,20 +1159,21 @@
         <w:tblLook w:firstColumn="1" w:firstRow="1" w:lastColumn="0" w:lastRow="0" w:noHBand="0" w:noVBand="1" w:val="04A0"/>
       </w:tblPr>
       <w:tblGrid>
-        <w:gridCol w:w="3137"/>
-        <w:gridCol w:w="3137"/>
-        <w:gridCol w:w="3137"/>
+        <w:gridCol w:w="3213"/>
+        <w:gridCol w:w="3213"/>
+        <w:gridCol w:w="3213"/>
       </w:tblGrid>
       <w:tr>
         <w:tc>
           <w:tcPr>
-            <w:tcW w:type="dxa" w:w="3137"/>
+            <w:tcW w:type="dxa" w:w="2608"/>
           </w:tcPr>
           <w:p>
             <w:r/>
             <w:r>
               <w:rPr>
                 <w:b/>
+                <w:sz w:val="19"/>
               </w:rPr>
               <w:t>步驟</w:t>
             </w:r>
@@ -796,13 +1181,14 @@
         </w:tc>
         <w:tc>
           <w:tcPr>
-            <w:tcW w:type="dxa" w:w="3137"/>
+            <w:tcW w:type="dxa" w:w="3118"/>
           </w:tcPr>
           <w:p>
             <w:r/>
             <w:r>
               <w:rPr>
                 <w:b/>
+                <w:sz w:val="19"/>
               </w:rPr>
               <w:t>新學生 X（1D、有電腦、出席 0）</w:t>
             </w:r>
@@ -810,13 +1196,14 @@
         </w:tc>
         <w:tc>
           <w:tcPr>
-            <w:tcW w:type="dxa" w:w="3137"/>
+            <w:tcW w:type="dxa" w:w="3118"/>
           </w:tcPr>
           <w:p>
             <w:r/>
             <w:r>
               <w:rPr>
                 <w:b/>
+                <w:sz w:val="19"/>
               </w:rPr>
               <w:t>新學生 Y（1D、無電腦、出席 2）</w:t>
             </w:r>
@@ -826,173 +1213,261 @@
       <w:tr>
         <w:tc>
           <w:tcPr>
-            <w:tcW w:type="dxa" w:w="3137"/>
+            <w:tcW w:type="dxa" w:w="2608"/>
           </w:tcPr>
           <w:p>
+            <w:r/>
             <w:r>
+              <w:rPr>
+                <w:sz w:val="19"/>
+              </w:rPr>
               <w:t>第 1 行：家中電腦＝有？</w:t>
             </w:r>
           </w:p>
         </w:tc>
         <w:tc>
           <w:tcPr>
-            <w:tcW w:type="dxa" w:w="3137"/>
+            <w:tcW w:type="dxa" w:w="3118"/>
           </w:tcPr>
           <w:p>
             <w:r/>
+            <w:r>
+              <w:rPr>
+                <w:sz w:val="19"/>
+              </w:rPr>
+            </w:r>
           </w:p>
         </w:tc>
         <w:tc>
           <w:tcPr>
-            <w:tcW w:type="dxa" w:w="3137"/>
+            <w:tcW w:type="dxa" w:w="3118"/>
           </w:tcPr>
           <w:p>
             <w:r/>
+            <w:r>
+              <w:rPr>
+                <w:sz w:val="19"/>
+              </w:rPr>
+            </w:r>
           </w:p>
         </w:tc>
       </w:tr>
       <w:tr>
         <w:tc>
           <w:tcPr>
-            <w:tcW w:type="dxa" w:w="3137"/>
+            <w:tcW w:type="dxa" w:w="2608"/>
           </w:tcPr>
           <w:p>
+            <w:r/>
             <w:r>
+              <w:rPr>
+                <w:sz w:val="19"/>
+              </w:rPr>
               <w:t>第 2 行：出席 ≥ 3？</w:t>
             </w:r>
           </w:p>
         </w:tc>
         <w:tc>
           <w:tcPr>
-            <w:tcW w:type="dxa" w:w="3137"/>
+            <w:tcW w:type="dxa" w:w="3118"/>
           </w:tcPr>
           <w:p>
             <w:r/>
+            <w:r>
+              <w:rPr>
+                <w:sz w:val="19"/>
+              </w:rPr>
+            </w:r>
           </w:p>
         </w:tc>
         <w:tc>
           <w:tcPr>
-            <w:tcW w:type="dxa" w:w="3137"/>
+            <w:tcW w:type="dxa" w:w="3118"/>
           </w:tcPr>
           <w:p>
             <w:r/>
+            <w:r>
+              <w:rPr>
+                <w:sz w:val="19"/>
+              </w:rPr>
+            </w:r>
           </w:p>
         </w:tc>
       </w:tr>
       <w:tr>
         <w:tc>
           <w:tcPr>
-            <w:tcW w:type="dxa" w:w="3137"/>
+            <w:tcW w:type="dxa" w:w="2608"/>
           </w:tcPr>
           <w:p>
+            <w:r/>
             <w:r>
+              <w:rPr>
+                <w:sz w:val="19"/>
+              </w:rPr>
               <w:t>第 3 行</w:t>
             </w:r>
           </w:p>
         </w:tc>
         <w:tc>
           <w:tcPr>
-            <w:tcW w:type="dxa" w:w="3137"/>
+            <w:tcW w:type="dxa" w:w="3118"/>
           </w:tcPr>
           <w:p>
             <w:r/>
+            <w:r>
+              <w:rPr>
+                <w:sz w:val="19"/>
+              </w:rPr>
+            </w:r>
           </w:p>
         </w:tc>
         <w:tc>
           <w:tcPr>
-            <w:tcW w:type="dxa" w:w="3137"/>
+            <w:tcW w:type="dxa" w:w="3118"/>
           </w:tcPr>
           <w:p>
             <w:r/>
+            <w:r>
+              <w:rPr>
+                <w:sz w:val="19"/>
+              </w:rPr>
+            </w:r>
           </w:p>
         </w:tc>
       </w:tr>
       <w:tr>
         <w:tc>
           <w:tcPr>
-            <w:tcW w:type="dxa" w:w="3137"/>
+            <w:tcW w:type="dxa" w:w="2608"/>
           </w:tcPr>
           <w:p>
+            <w:r/>
             <w:r>
+              <w:rPr>
+                <w:sz w:val="19"/>
+              </w:rPr>
               <w:t>結果</w:t>
             </w:r>
           </w:p>
         </w:tc>
         <w:tc>
           <w:tcPr>
-            <w:tcW w:type="dxa" w:w="3137"/>
+            <w:tcW w:type="dxa" w:w="3118"/>
           </w:tcPr>
           <w:p>
             <w:r/>
+            <w:r>
+              <w:rPr>
+                <w:sz w:val="19"/>
+              </w:rPr>
+            </w:r>
           </w:p>
         </w:tc>
         <w:tc>
           <w:tcPr>
-            <w:tcW w:type="dxa" w:w="3137"/>
+            <w:tcW w:type="dxa" w:w="3118"/>
           </w:tcPr>
           <w:p>
             <w:r/>
+            <w:r>
+              <w:rPr>
+                <w:sz w:val="19"/>
+              </w:rPr>
+            </w:r>
           </w:p>
         </w:tc>
       </w:tr>
       <w:tr>
         <w:tc>
           <w:tcPr>
-            <w:tcW w:type="dxa" w:w="3137"/>
+            <w:tcW w:type="dxa" w:w="2608"/>
           </w:tcPr>
           <w:p>
+            <w:r/>
             <w:r>
+              <w:rPr>
+                <w:sz w:val="19"/>
+              </w:rPr>
               <w:t>哪一行決定</w:t>
             </w:r>
           </w:p>
         </w:tc>
         <w:tc>
           <w:tcPr>
-            <w:tcW w:type="dxa" w:w="3137"/>
+            <w:tcW w:type="dxa" w:w="3118"/>
           </w:tcPr>
           <w:p>
             <w:r/>
+            <w:r>
+              <w:rPr>
+                <w:sz w:val="19"/>
+              </w:rPr>
+            </w:r>
           </w:p>
         </w:tc>
         <w:tc>
           <w:tcPr>
-            <w:tcW w:type="dxa" w:w="3137"/>
+            <w:tcW w:type="dxa" w:w="3118"/>
           </w:tcPr>
           <w:p>
             <w:r/>
+            <w:r>
+              <w:rPr>
+                <w:sz w:val="19"/>
+              </w:rPr>
+            </w:r>
           </w:p>
         </w:tc>
       </w:tr>
       <w:tr>
         <w:tc>
           <w:tcPr>
-            <w:tcW w:type="dxa" w:w="3137"/>
+            <w:tcW w:type="dxa" w:w="2608"/>
           </w:tcPr>
           <w:p>
+            <w:r/>
             <w:r>
-              <w:t>有問題嗎？</w:t>
+              <w:rPr>
+                <w:sz w:val="19"/>
+              </w:rPr>
+              <w:t>有甚麼問題？</w:t>
             </w:r>
           </w:p>
         </w:tc>
         <w:tc>
           <w:tcPr>
-            <w:tcW w:type="dxa" w:w="3137"/>
+            <w:tcW w:type="dxa" w:w="3118"/>
           </w:tcPr>
           <w:p>
             <w:r/>
+            <w:r>
+              <w:rPr>
+                <w:sz w:val="19"/>
+              </w:rPr>
+            </w:r>
           </w:p>
         </w:tc>
         <w:tc>
           <w:tcPr>
-            <w:tcW w:type="dxa" w:w="3137"/>
+            <w:tcW w:type="dxa" w:w="3118"/>
           </w:tcPr>
           <w:p>
             <w:r/>
+            <w:r>
+              <w:rPr>
+                <w:sz w:val="19"/>
+              </w:rPr>
+            </w:r>
           </w:p>
         </w:tc>
       </w:tr>
     </w:tbl>
-    <w:p/>
+    <w:p>
+      <w:r>
+        <w:br w:type="page"/>
+      </w:r>
+    </w:p>
     <w:p>
       <w:pPr>
         <w:pStyle w:val="Heading2"/>
@@ -1003,7 +1478,15 @@
     </w:p>
     <w:p>
       <w:r>
-        <w:t>提出一個改動（改規則或改資料），並填表。</w:t>
+        <w:t>提出一個改動（改規則或改資料），並填表：它幫到誰、可能不利於誰、仍做不到甚麼。下面這一頁是示範（已經填好的一列）；填寫頁在再下一頁。</w:t>
+      </w:r>
+    </w:p>
+    <w:p>
+      <w:pPr>
+        <w:pStyle w:val="Heading3"/>
+      </w:pPr>
+      <w:r>
+        <w:t>示範頁：一列填好的答案</w:t>
       </w:r>
     </w:p>
     <w:tbl>
@@ -1013,21 +1496,22 @@
         <w:tblLook w:firstColumn="1" w:firstRow="1" w:lastColumn="0" w:lastRow="0" w:noHBand="0" w:noVBand="1" w:val="04A0"/>
       </w:tblPr>
       <w:tblGrid>
-        <w:gridCol w:w="2353"/>
-        <w:gridCol w:w="2353"/>
-        <w:gridCol w:w="2353"/>
-        <w:gridCol w:w="2353"/>
+        <w:gridCol w:w="2409"/>
+        <w:gridCol w:w="2409"/>
+        <w:gridCol w:w="2409"/>
+        <w:gridCol w:w="2409"/>
       </w:tblGrid>
       <w:tr>
         <w:tc>
           <w:tcPr>
-            <w:tcW w:type="dxa" w:w="2353"/>
+            <w:tcW w:type="dxa" w:w="2381"/>
           </w:tcPr>
           <w:p>
             <w:r/>
             <w:r>
               <w:rPr>
                 <w:b/>
+                <w:sz w:val="19"/>
               </w:rPr>
               <w:t>改動</w:t>
             </w:r>
@@ -1035,13 +1519,14 @@
         </w:tc>
         <w:tc>
           <w:tcPr>
-            <w:tcW w:type="dxa" w:w="2353"/>
+            <w:tcW w:type="dxa" w:w="2381"/>
           </w:tcPr>
           <w:p>
             <w:r/>
             <w:r>
               <w:rPr>
                 <w:b/>
+                <w:sz w:val="19"/>
               </w:rPr>
               <w:t>幫到誰</w:t>
             </w:r>
@@ -1049,13 +1534,14 @@
         </w:tc>
         <w:tc>
           <w:tcPr>
-            <w:tcW w:type="dxa" w:w="2353"/>
+            <w:tcW w:type="dxa" w:w="2438"/>
           </w:tcPr>
           <w:p>
             <w:r/>
             <w:r>
               <w:rPr>
                 <w:b/>
+                <w:sz w:val="19"/>
               </w:rPr>
               <w:t>可能不利於誰</w:t>
             </w:r>
@@ -1063,13 +1549,14 @@
         </w:tc>
         <w:tc>
           <w:tcPr>
-            <w:tcW w:type="dxa" w:w="2353"/>
+            <w:tcW w:type="dxa" w:w="2438"/>
           </w:tcPr>
           <w:p>
             <w:r/>
             <w:r>
               <w:rPr>
                 <w:b/>
+                <w:sz w:val="19"/>
               </w:rPr>
               <w:t>仍做不到甚麼</w:t>
             </w:r>
@@ -1079,73 +1566,268 @@
       <w:tr>
         <w:tc>
           <w:tcPr>
-            <w:tcW w:type="dxa" w:w="2353"/>
+            <w:tcW w:type="dxa" w:w="2381"/>
           </w:tcPr>
           <w:p>
             <w:r/>
+            <w:r>
+              <w:rPr>
+                <w:sz w:val="19"/>
+              </w:rPr>
+              <w:t>把第 1 行的「家中電腦＝有」改成「出席節數 ≥ 1」。</w:t>
+            </w:r>
           </w:p>
         </w:tc>
         <w:tc>
           <w:tcPr>
-            <w:tcW w:type="dxa" w:w="2353"/>
+            <w:tcW w:type="dxa" w:w="2381"/>
           </w:tcPr>
           <w:p>
             <w:r/>
+            <w:r>
+              <w:rPr>
+                <w:sz w:val="19"/>
+              </w:rPr>
+              <w:t>家裏沒有電腦但有興趣、來過至少一節的學生，例如 F。</w:t>
+            </w:r>
           </w:p>
         </w:tc>
         <w:tc>
           <w:tcPr>
-            <w:tcW w:type="dxa" w:w="2353"/>
+            <w:tcW w:type="dxa" w:w="2438"/>
           </w:tcPr>
           <w:p>
             <w:r/>
+            <w:r>
+              <w:rPr>
+                <w:sz w:val="19"/>
+              </w:rPr>
+              <w:t>從未出席、但其實很想參加的學生——他們仍然會被第 2 行擋住，例如整個學期病假的那位。</w:t>
+            </w:r>
           </w:p>
         </w:tc>
         <w:tc>
           <w:tcPr>
-            <w:tcW w:type="dxa" w:w="2353"/>
+            <w:tcW w:type="dxa" w:w="2438"/>
           </w:tcPr>
           <w:p>
             <w:r/>
+            <w:r>
+              <w:rPr>
+                <w:sz w:val="19"/>
+              </w:rPr>
+              <w:t>不知道學生為甚麼想參加，也不知道這份興趣會不會持續；這條規則只看見出席次數。</w:t>
+            </w:r>
+          </w:p>
+        </w:tc>
+      </w:tr>
+    </w:tbl>
+    <w:p>
+      <w:r>
+        <w:t>為甚麼這一列算達標：四格都有具體內容；「不利於誰」講得出是哪一種學生、為甚麼被擋；「仍做不到」講的是這條規則本身看不見的東西（動機與持續），而不是「要再做好一點」。</w:t>
+      </w:r>
+    </w:p>
+    <w:p>
+      <w:r>
+        <w:br w:type="page"/>
+      </w:r>
+    </w:p>
+    <w:p>
+      <w:pPr>
+        <w:pStyle w:val="Heading3"/>
+      </w:pPr>
+      <w:r>
+        <w:t>填寫頁：你的一列</w:t>
+      </w:r>
+    </w:p>
+    <w:tbl>
+      <w:tblPr>
+        <w:tblStyle w:val="TableGrid"/>
+        <w:tblW w:type="auto" w:w="0"/>
+        <w:tblLook w:firstColumn="1" w:firstRow="1" w:lastColumn="0" w:lastRow="0" w:noHBand="0" w:noVBand="1" w:val="04A0"/>
+      </w:tblPr>
+      <w:tblGrid>
+        <w:gridCol w:w="2409"/>
+        <w:gridCol w:w="2409"/>
+        <w:gridCol w:w="2409"/>
+        <w:gridCol w:w="2409"/>
+      </w:tblGrid>
+      <w:tr>
+        <w:tc>
+          <w:tcPr>
+            <w:tcW w:type="dxa" w:w="2381"/>
+          </w:tcPr>
+          <w:p>
+            <w:r/>
+            <w:r>
+              <w:rPr>
+                <w:b/>
+                <w:sz w:val="19"/>
+              </w:rPr>
+              <w:t>改動</w:t>
+            </w:r>
+          </w:p>
+        </w:tc>
+        <w:tc>
+          <w:tcPr>
+            <w:tcW w:type="dxa" w:w="2381"/>
+          </w:tcPr>
+          <w:p>
+            <w:r/>
+            <w:r>
+              <w:rPr>
+                <w:b/>
+                <w:sz w:val="19"/>
+              </w:rPr>
+              <w:t>幫到誰</w:t>
+            </w:r>
+          </w:p>
+        </w:tc>
+        <w:tc>
+          <w:tcPr>
+            <w:tcW w:type="dxa" w:w="2438"/>
+          </w:tcPr>
+          <w:p>
+            <w:r/>
+            <w:r>
+              <w:rPr>
+                <w:b/>
+                <w:sz w:val="19"/>
+              </w:rPr>
+              <w:t>可能不利於誰</w:t>
+            </w:r>
+          </w:p>
+        </w:tc>
+        <w:tc>
+          <w:tcPr>
+            <w:tcW w:type="dxa" w:w="2438"/>
+          </w:tcPr>
+          <w:p>
+            <w:r/>
+            <w:r>
+              <w:rPr>
+                <w:b/>
+                <w:sz w:val="19"/>
+              </w:rPr>
+              <w:t>仍做不到甚麼</w:t>
+            </w:r>
           </w:p>
         </w:tc>
       </w:tr>
       <w:tr>
         <w:tc>
           <w:tcPr>
-            <w:tcW w:type="dxa" w:w="2353"/>
+            <w:tcW w:type="dxa" w:w="2381"/>
           </w:tcPr>
           <w:p>
             <w:r/>
+            <w:r>
+              <w:rPr>
+                <w:sz w:val="19"/>
+              </w:rPr>
+            </w:r>
           </w:p>
         </w:tc>
         <w:tc>
           <w:tcPr>
-            <w:tcW w:type="dxa" w:w="2353"/>
+            <w:tcW w:type="dxa" w:w="2381"/>
           </w:tcPr>
           <w:p>
             <w:r/>
+            <w:r>
+              <w:rPr>
+                <w:sz w:val="19"/>
+              </w:rPr>
+            </w:r>
           </w:p>
         </w:tc>
         <w:tc>
           <w:tcPr>
-            <w:tcW w:type="dxa" w:w="2353"/>
+            <w:tcW w:type="dxa" w:w="2438"/>
           </w:tcPr>
           <w:p>
             <w:r/>
+            <w:r>
+              <w:rPr>
+                <w:sz w:val="19"/>
+              </w:rPr>
+            </w:r>
           </w:p>
         </w:tc>
         <w:tc>
           <w:tcPr>
-            <w:tcW w:type="dxa" w:w="2353"/>
+            <w:tcW w:type="dxa" w:w="2438"/>
           </w:tcPr>
           <w:p>
             <w:r/>
+            <w:r>
+              <w:rPr>
+                <w:sz w:val="19"/>
+              </w:rPr>
+            </w:r>
+          </w:p>
+        </w:tc>
+      </w:tr>
+      <w:tr>
+        <w:tc>
+          <w:tcPr>
+            <w:tcW w:type="dxa" w:w="2381"/>
+          </w:tcPr>
+          <w:p>
+            <w:r/>
+            <w:r>
+              <w:rPr>
+                <w:sz w:val="19"/>
+              </w:rPr>
+            </w:r>
+          </w:p>
+        </w:tc>
+        <w:tc>
+          <w:tcPr>
+            <w:tcW w:type="dxa" w:w="2381"/>
+          </w:tcPr>
+          <w:p>
+            <w:r/>
+            <w:r>
+              <w:rPr>
+                <w:sz w:val="19"/>
+              </w:rPr>
+            </w:r>
+          </w:p>
+        </w:tc>
+        <w:tc>
+          <w:tcPr>
+            <w:tcW w:type="dxa" w:w="2438"/>
+          </w:tcPr>
+          <w:p>
+            <w:r/>
+            <w:r>
+              <w:rPr>
+                <w:sz w:val="19"/>
+              </w:rPr>
+            </w:r>
+          </w:p>
+        </w:tc>
+        <w:tc>
+          <w:tcPr>
+            <w:tcW w:type="dxa" w:w="2438"/>
+          </w:tcPr>
+          <w:p>
+            <w:r/>
+            <w:r>
+              <w:rPr>
+                <w:sz w:val="19"/>
+              </w:rPr>
+            </w:r>
           </w:p>
         </w:tc>
       </w:tr>
     </w:tbl>
-    <w:p/>
+    <w:p>
+      <w:r>
+        <w:br w:type="page"/>
+      </w:r>
+    </w:p>
     <w:p>
       <w:pPr>
         <w:pStyle w:val="Heading2"/>
@@ -1191,6 +1873,38 @@
         <w:t>必須由真人（老師）看過才作決定的情況：＿＿＿＿＿＿</w:t>
       </w:r>
     </w:p>
+    <w:p>
+      <w:r>
+        <w:t>三行提示（每一句都要寫到這個程度）：</w:t>
+      </w:r>
+    </w:p>
+    <w:p>
+      <w:pPr>
+        <w:pStyle w:val="ListBullet"/>
+      </w:pPr>
+      <w:r>
+        <w:t>「可以用於」寫一個具體用途，例如「提示哪些同學可能想試堂」；不要寫「幫助學生」。</w:t>
+      </w:r>
+    </w:p>
+    <w:p>
+      <w:pPr>
+        <w:pStyle w:val="ListBullet"/>
+      </w:pPr>
+      <w:r>
+        <w:t>「不可以用於」寫一種具體傷害，例如「不可決定誰不可參加」；不要寫「小心使用」。</w:t>
+      </w:r>
+    </w:p>
+    <w:p>
+      <w:pPr>
+        <w:pStyle w:val="ListBullet"/>
+      </w:pPr>
+      <w:r>
+        <w:t>「必須由真人看」寫一個觸發點，例如「系統說不推薦，但老師知道學生很有興趣」；不要寫「有時要人看」。</w:t>
+      </w:r>
+    </w:p>
+    <w:p/>
+    <w:p/>
+    <w:p/>
     <w:p/>
     <w:p/>
     <w:p/>
@@ -1208,35 +1922,8 @@
       </w:r>
     </w:p>
     <w:p>
-      <w:pPr>
-        <w:pStyle w:val="Heading2"/>
-      </w:pPr>
       <w:r>
-        <w:t>任務一：找出資料偏斜</w:t>
-      </w:r>
-    </w:p>
-    <w:p>
-      <w:pPr>
-        <w:pStyle w:val="ListBullet"/>
-      </w:pPr>
-      <w:r>
-        <w:t>揹起決定的屬性：「家中電腦」。六個「留低並享受」的舊生中，五個（A–E）都有電腦在家；規則的第 1 行單靠它便決定了五個個案。</w:t>
-      </w:r>
-    </w:p>
-    <w:p>
-      <w:pPr>
-        <w:pStyle w:val="ListBullet"/>
-      </w:pPr>
-      <w:r>
-        <w:t>沒有被代表的學生：1D 全班沒有紀錄（八個舊生中，四個來自 1A、三個 1B、一個 1C，1D 一個也沒有）。</w:t>
-      </w:r>
-    </w:p>
-    <w:p>
-      <w:pPr>
-        <w:pStyle w:val="ListBullet"/>
-      </w:pPr>
-      <w:r>
-        <w:t>這是資料問題，不是學生問題：資料量度的是「有沒有電腦」，不是「有沒有興趣」；有電腦的學生被過度代表，令系統誤以為「有電腦」是原因。好答案會說出「資料量度了甚麼、遺漏了甚麼」。</w:t>
+        <w:t>答案以示範形式給出：先看任務一的四問四答，再看任務二的追蹤示範、任務三的完整示範本與未達標對照，然後用三份學生作品原文練習判分，最後是教師六十秒批改流程。全部人物、學校與資料均為虛構。</w:t>
       </w:r>
     </w:p>
     <w:p>
@@ -1244,7 +1931,102 @@
         <w:pStyle w:val="Heading2"/>
       </w:pPr>
       <w:r>
-        <w:t>任務二：追蹤規則（答案）</w:t>
+        <w:t>四問四答（任務一）</w:t>
+      </w:r>
+    </w:p>
+    <w:p>
+      <w:r>
+        <w:t>四條問題就是檢查清單的四條。示範答案都帶著一個數目，因為沒有數目的一句話，分不出是想法還是證據。</w:t>
+      </w:r>
+    </w:p>
+    <w:p>
+      <w:pPr>
+        <w:pStyle w:val="Heading3"/>
+      </w:pPr>
+      <w:r>
+        <w:t>問一：哪一個屬性「揹起」了決定？</w:t>
+      </w:r>
+    </w:p>
+    <w:p>
+      <w:r>
+        <w:t>答（示範）：「家中電腦」。結果是「是」的舊生有六個（A、B、C、D、E、G），其中五個有電腦（A、B、C、D、E），只有 G 沒有。所以「有電腦」幾乎等於「留低」，而規則第 1 行用的正是它——單靠這一行就決定了五個個案。</w:t>
+      </w:r>
+    </w:p>
+    <w:p>
+      <w:r>
+        <w:t>我的數目：6 個之中 5 個。</w:t>
+      </w:r>
+    </w:p>
+    <w:p>
+      <w:pPr>
+        <w:pStyle w:val="Heading3"/>
+      </w:pPr>
+      <w:r>
+        <w:t>問二：哪一類學生沒有被代表？</w:t>
+      </w:r>
+    </w:p>
+    <w:p>
+      <w:r>
+        <w:t>答（示範）：1D 全班。八個舊生之中，1A 四個（A、B、E、H）、1B 三個（C、D、G）、1C 一個（F），1D 一個也沒有。系統對 1D 一無所知，卻仍然要對 1D 的 X 和 Y 下判斷。</w:t>
+      </w:r>
+    </w:p>
+    <w:p>
+      <w:r>
+        <w:t>我的數目：1D＝0 人。</w:t>
+      </w:r>
+    </w:p>
+    <w:p>
+      <w:pPr>
+        <w:pStyle w:val="Heading3"/>
+      </w:pPr>
+      <w:r>
+        <w:t>問三：資料量度的是甚麼？遺漏了甚麼？</w:t>
+      </w:r>
+    </w:p>
+    <w:p>
+      <w:r>
+        <w:t>答（示範）：資料量度的是「學校有記錄到」的四項——班別、家中有沒有電腦、出席了幾節、有沒有人接放學。遺漏的是「有沒有興趣」和「為甚麼想參加」，也就是這個系統本來要回答的問題。所以資料裏「有電腦」的學生多，不代表「有電腦」就是原因。</w:t>
+      </w:r>
+    </w:p>
+    <w:p>
+      <w:r>
+        <w:t>我的數目：4 欄之中，0 欄量度興趣。</w:t>
+      </w:r>
+    </w:p>
+    <w:p>
+      <w:pPr>
+        <w:pStyle w:val="Heading3"/>
+      </w:pPr>
+      <w:r>
+        <w:t>問四：這是資料問題，還是學生問題？為甚麼？</w:t>
+      </w:r>
+    </w:p>
+    <w:p>
+      <w:r>
+        <w:t>答（示範）：資料問題。F 出席了 3 節、明顯有興趣，只因家裏沒有電腦，結果就被記成「否」。出錯的是紀錄選了甚麼、漏了甚麼，不是 F。</w:t>
+      </w:r>
+    </w:p>
+    <w:p>
+      <w:r>
+        <w:t>我的數目：1 個被錯記的個案（F）——3 節出席，0 個結論支持。</w:t>
+      </w:r>
+    </w:p>
+    <w:p>
+      <w:r>
+        <w:t>四問都答得出、而且每一答都帶著一個數目，任務一即達標。只寫「這個系統有偏見」而沒有數目，屬未達標：那句話沒有指出是哪一欄、哪幾個人。</w:t>
+      </w:r>
+    </w:p>
+    <w:p>
+      <w:pPr>
+        <w:pStyle w:val="Heading2"/>
+      </w:pPr>
+      <w:r>
+        <w:t>任務二：追蹤規則（示範）</w:t>
+      </w:r>
+    </w:p>
+    <w:p>
+      <w:r>
+        <w:t>答案的關鍵不是「推薦／不推薦」，而是「哪一行」。</w:t>
       </w:r>
     </w:p>
     <w:tbl>
@@ -1254,20 +2036,21 @@
         <w:tblLook w:firstColumn="1" w:firstRow="1" w:lastColumn="0" w:lastRow="0" w:noHBand="0" w:noVBand="1" w:val="04A0"/>
       </w:tblPr>
       <w:tblGrid>
-        <w:gridCol w:w="3137"/>
-        <w:gridCol w:w="3137"/>
-        <w:gridCol w:w="3137"/>
+        <w:gridCol w:w="3213"/>
+        <w:gridCol w:w="3213"/>
+        <w:gridCol w:w="3213"/>
       </w:tblGrid>
       <w:tr>
         <w:tc>
           <w:tcPr>
-            <w:tcW w:type="dxa" w:w="3137"/>
+            <w:tcW w:type="dxa" w:w="2608"/>
           </w:tcPr>
           <w:p>
             <w:r/>
             <w:r>
               <w:rPr>
                 <w:b/>
+                <w:sz w:val="19"/>
               </w:rPr>
               <w:t>步驟</w:t>
             </w:r>
@@ -1275,13 +2058,14 @@
         </w:tc>
         <w:tc>
           <w:tcPr>
-            <w:tcW w:type="dxa" w:w="3137"/>
+            <w:tcW w:type="dxa" w:w="3118"/>
           </w:tcPr>
           <w:p>
             <w:r/>
             <w:r>
               <w:rPr>
                 <w:b/>
+                <w:sz w:val="19"/>
               </w:rPr>
               <w:t>新學生 X（1D、有電腦、出席 0）</w:t>
             </w:r>
@@ -1289,13 +2073,14 @@
         </w:tc>
         <w:tc>
           <w:tcPr>
-            <w:tcW w:type="dxa" w:w="3137"/>
+            <w:tcW w:type="dxa" w:w="3118"/>
           </w:tcPr>
           <w:p>
             <w:r/>
             <w:r>
               <w:rPr>
                 <w:b/>
+                <w:sz w:val="19"/>
               </w:rPr>
               <w:t>新學生 Y（1D、無電腦、出席 2）</w:t>
             </w:r>
@@ -1305,30 +2090,42 @@
       <w:tr>
         <w:tc>
           <w:tcPr>
-            <w:tcW w:type="dxa" w:w="3137"/>
+            <w:tcW w:type="dxa" w:w="2608"/>
           </w:tcPr>
           <w:p>
+            <w:r/>
             <w:r>
+              <w:rPr>
+                <w:sz w:val="19"/>
+              </w:rPr>
               <w:t>第 1 行：家中電腦＝有？</w:t>
             </w:r>
           </w:p>
         </w:tc>
         <w:tc>
           <w:tcPr>
-            <w:tcW w:type="dxa" w:w="3137"/>
+            <w:tcW w:type="dxa" w:w="3118"/>
           </w:tcPr>
           <w:p>
+            <w:r/>
             <w:r>
+              <w:rPr>
+                <w:sz w:val="19"/>
+              </w:rPr>
               <w:t>是 → 推薦（停在第 1 行）</w:t>
             </w:r>
           </w:p>
         </w:tc>
         <w:tc>
           <w:tcPr>
-            <w:tcW w:type="dxa" w:w="3137"/>
+            <w:tcW w:type="dxa" w:w="3118"/>
           </w:tcPr>
           <w:p>
+            <w:r/>
             <w:r>
+              <w:rPr>
+                <w:sz w:val="19"/>
+              </w:rPr>
               <w:t>否 → 落到第 2 行</w:t>
             </w:r>
           </w:p>
@@ -1337,30 +2134,42 @@
       <w:tr>
         <w:tc>
           <w:tcPr>
-            <w:tcW w:type="dxa" w:w="3137"/>
+            <w:tcW w:type="dxa" w:w="2608"/>
           </w:tcPr>
           <w:p>
+            <w:r/>
             <w:r>
+              <w:rPr>
+                <w:sz w:val="19"/>
+              </w:rPr>
               <w:t>第 2 行：出席 ≥ 3？</w:t>
             </w:r>
           </w:p>
         </w:tc>
         <w:tc>
           <w:tcPr>
-            <w:tcW w:type="dxa" w:w="3137"/>
+            <w:tcW w:type="dxa" w:w="3118"/>
           </w:tcPr>
           <w:p>
+            <w:r/>
             <w:r>
+              <w:rPr>
+                <w:sz w:val="19"/>
+              </w:rPr>
               <w:t>不適用</w:t>
             </w:r>
           </w:p>
         </w:tc>
         <w:tc>
           <w:tcPr>
-            <w:tcW w:type="dxa" w:w="3137"/>
+            <w:tcW w:type="dxa" w:w="3118"/>
           </w:tcPr>
           <w:p>
+            <w:r/>
             <w:r>
+              <w:rPr>
+                <w:sz w:val="19"/>
+              </w:rPr>
               <w:t>否（2 &lt; 3）→ 落到第 3 行</w:t>
             </w:r>
           </w:p>
@@ -1369,30 +2178,42 @@
       <w:tr>
         <w:tc>
           <w:tcPr>
-            <w:tcW w:type="dxa" w:w="3137"/>
+            <w:tcW w:type="dxa" w:w="2608"/>
           </w:tcPr>
           <w:p>
+            <w:r/>
             <w:r>
+              <w:rPr>
+                <w:sz w:val="19"/>
+              </w:rPr>
               <w:t>第 3 行</w:t>
             </w:r>
           </w:p>
         </w:tc>
         <w:tc>
           <w:tcPr>
-            <w:tcW w:type="dxa" w:w="3137"/>
+            <w:tcW w:type="dxa" w:w="3118"/>
           </w:tcPr>
           <w:p>
+            <w:r/>
             <w:r>
+              <w:rPr>
+                <w:sz w:val="19"/>
+              </w:rPr>
               <w:t>不適用</w:t>
             </w:r>
           </w:p>
         </w:tc>
         <w:tc>
           <w:tcPr>
-            <w:tcW w:type="dxa" w:w="3137"/>
+            <w:tcW w:type="dxa" w:w="3118"/>
           </w:tcPr>
           <w:p>
+            <w:r/>
             <w:r>
+              <w:rPr>
+                <w:sz w:val="19"/>
+              </w:rPr>
               <w:t>→ 不推薦</w:t>
             </w:r>
           </w:p>
@@ -1401,30 +2222,42 @@
       <w:tr>
         <w:tc>
           <w:tcPr>
-            <w:tcW w:type="dxa" w:w="3137"/>
+            <w:tcW w:type="dxa" w:w="2608"/>
           </w:tcPr>
           <w:p>
+            <w:r/>
             <w:r>
+              <w:rPr>
+                <w:sz w:val="19"/>
+              </w:rPr>
               <w:t>結果</w:t>
             </w:r>
           </w:p>
         </w:tc>
         <w:tc>
           <w:tcPr>
-            <w:tcW w:type="dxa" w:w="3137"/>
+            <w:tcW w:type="dxa" w:w="3118"/>
           </w:tcPr>
           <w:p>
+            <w:r/>
             <w:r>
+              <w:rPr>
+                <w:sz w:val="19"/>
+              </w:rPr>
               <w:t>推薦</w:t>
             </w:r>
           </w:p>
         </w:tc>
         <w:tc>
           <w:tcPr>
-            <w:tcW w:type="dxa" w:w="3137"/>
+            <w:tcW w:type="dxa" w:w="3118"/>
           </w:tcPr>
           <w:p>
+            <w:r/>
             <w:r>
+              <w:rPr>
+                <w:sz w:val="19"/>
+              </w:rPr>
               <w:t>不推薦</w:t>
             </w:r>
           </w:p>
@@ -1433,30 +2266,42 @@
       <w:tr>
         <w:tc>
           <w:tcPr>
-            <w:tcW w:type="dxa" w:w="3137"/>
+            <w:tcW w:type="dxa" w:w="2608"/>
           </w:tcPr>
           <w:p>
+            <w:r/>
             <w:r>
+              <w:rPr>
+                <w:sz w:val="19"/>
+              </w:rPr>
               <w:t>哪一行決定</w:t>
             </w:r>
           </w:p>
         </w:tc>
         <w:tc>
           <w:tcPr>
-            <w:tcW w:type="dxa" w:w="3137"/>
+            <w:tcW w:type="dxa" w:w="3118"/>
           </w:tcPr>
           <w:p>
+            <w:r/>
             <w:r>
+              <w:rPr>
+                <w:sz w:val="19"/>
+              </w:rPr>
               <w:t>第 1 行</w:t>
             </w:r>
           </w:p>
         </w:tc>
         <w:tc>
           <w:tcPr>
-            <w:tcW w:type="dxa" w:w="3137"/>
+            <w:tcW w:type="dxa" w:w="3118"/>
           </w:tcPr>
           <w:p>
+            <w:r/>
             <w:r>
+              <w:rPr>
+                <w:sz w:val="19"/>
+              </w:rPr>
               <w:t>第 3 行</w:t>
             </w:r>
           </w:p>
@@ -1465,30 +2310,42 @@
       <w:tr>
         <w:tc>
           <w:tcPr>
-            <w:tcW w:type="dxa" w:w="3137"/>
+            <w:tcW w:type="dxa" w:w="2608"/>
           </w:tcPr>
           <w:p>
+            <w:r/>
             <w:r>
-              <w:t>有問題嗎？</w:t>
+              <w:rPr>
+                <w:sz w:val="19"/>
+              </w:rPr>
+              <w:t>有甚麼問題？</w:t>
             </w:r>
           </w:p>
         </w:tc>
         <w:tc>
           <w:tcPr>
-            <w:tcW w:type="dxa" w:w="3137"/>
+            <w:tcW w:type="dxa" w:w="3118"/>
           </w:tcPr>
           <w:p>
+            <w:r/>
             <w:r>
-              <w:t>有——X 從未出席，只因「有電腦」就被推薦</w:t>
+              <w:rPr>
+                <w:sz w:val="19"/>
+              </w:rPr>
+              <w:t>有——X 從未出席過，只因「有電腦」就被推薦</w:t>
             </w:r>
           </w:p>
         </w:tc>
         <w:tc>
           <w:tcPr>
-            <w:tcW w:type="dxa" w:w="3137"/>
+            <w:tcW w:type="dxa" w:w="3118"/>
           </w:tcPr>
           <w:p>
+            <w:r/>
             <w:r>
+              <w:rPr>
+                <w:sz w:val="19"/>
+              </w:rPr>
               <w:t>有——Y 出席過 2 節、來自 1D（訓練資料沒有 1D），只因門檻與資料缺口被拒</w:t>
             </w:r>
           </w:p>
@@ -1500,7 +2357,7 @@
         <w:pStyle w:val="Heading2"/>
       </w:pPr>
       <w:r>
-        <w:t>任務三：修復與代價（例子）</w:t>
+        <w:t>任務三：完整示範本</w:t>
       </w:r>
     </w:p>
     <w:tbl>
@@ -1510,21 +2367,22 @@
         <w:tblLook w:firstColumn="1" w:firstRow="1" w:lastColumn="0" w:lastRow="0" w:noHBand="0" w:noVBand="1" w:val="04A0"/>
       </w:tblPr>
       <w:tblGrid>
-        <w:gridCol w:w="2353"/>
-        <w:gridCol w:w="2353"/>
-        <w:gridCol w:w="2353"/>
-        <w:gridCol w:w="2353"/>
+        <w:gridCol w:w="2409"/>
+        <w:gridCol w:w="2409"/>
+        <w:gridCol w:w="2409"/>
+        <w:gridCol w:w="2409"/>
       </w:tblGrid>
       <w:tr>
         <w:tc>
           <w:tcPr>
-            <w:tcW w:type="dxa" w:w="2353"/>
+            <w:tcW w:type="dxa" w:w="2381"/>
           </w:tcPr>
           <w:p>
             <w:r/>
             <w:r>
               <w:rPr>
                 <w:b/>
+                <w:sz w:val="19"/>
               </w:rPr>
               <w:t>改動</w:t>
             </w:r>
@@ -1532,13 +2390,14 @@
         </w:tc>
         <w:tc>
           <w:tcPr>
-            <w:tcW w:type="dxa" w:w="2353"/>
+            <w:tcW w:type="dxa" w:w="2381"/>
           </w:tcPr>
           <w:p>
             <w:r/>
             <w:r>
               <w:rPr>
                 <w:b/>
+                <w:sz w:val="19"/>
               </w:rPr>
               <w:t>幫到誰</w:t>
             </w:r>
@@ -1546,13 +2405,14 @@
         </w:tc>
         <w:tc>
           <w:tcPr>
-            <w:tcW w:type="dxa" w:w="2353"/>
+            <w:tcW w:type="dxa" w:w="2438"/>
           </w:tcPr>
           <w:p>
             <w:r/>
             <w:r>
               <w:rPr>
                 <w:b/>
+                <w:sz w:val="19"/>
               </w:rPr>
               <w:t>可能不利於誰</w:t>
             </w:r>
@@ -1560,13 +2420,14 @@
         </w:tc>
         <w:tc>
           <w:tcPr>
-            <w:tcW w:type="dxa" w:w="2353"/>
+            <w:tcW w:type="dxa" w:w="2438"/>
           </w:tcPr>
           <w:p>
             <w:r/>
             <w:r>
               <w:rPr>
                 <w:b/>
+                <w:sz w:val="19"/>
               </w:rPr>
               <w:t>仍做不到甚麼</w:t>
             </w:r>
@@ -1576,125 +2437,57 @@
       <w:tr>
         <w:tc>
           <w:tcPr>
-            <w:tcW w:type="dxa" w:w="2353"/>
+            <w:tcW w:type="dxa" w:w="2381"/>
           </w:tcPr>
           <w:p>
+            <w:r/>
             <w:r>
-              <w:t>把第 1 行的「家中電腦」改成「出席節數 ≥ 1」</w:t>
+              <w:rPr>
+                <w:sz w:val="19"/>
+              </w:rPr>
+              <w:t>把第 1 行的「家中電腦＝有」改成「出席節數 ≥ 1」。</w:t>
             </w:r>
           </w:p>
         </w:tc>
         <w:tc>
           <w:tcPr>
-            <w:tcW w:type="dxa" w:w="2353"/>
+            <w:tcW w:type="dxa" w:w="2381"/>
           </w:tcPr>
           <w:p>
+            <w:r/>
             <w:r>
-              <w:t>沒有電腦在家但有興趣、出席過的學生</w:t>
+              <w:rPr>
+                <w:sz w:val="19"/>
+              </w:rPr>
+              <w:t>家裏沒有電腦但有興趣、來過至少一節的學生，例如 F。</w:t>
             </w:r>
           </w:p>
         </w:tc>
         <w:tc>
           <w:tcPr>
-            <w:tcW w:type="dxa" w:w="2353"/>
+            <w:tcW w:type="dxa" w:w="2438"/>
           </w:tcPr>
           <w:p>
+            <w:r/>
             <w:r>
-              <w:t>從未出席但其實有興趣的學生（被門檻擋住）</w:t>
+              <w:rPr>
+                <w:sz w:val="19"/>
+              </w:rPr>
+              <w:t>從未出席、但其實很想參加的學生——他們仍然會被第 2 行（出席 ≥ 3）擋住，例如整個學期病假的那位。</w:t>
             </w:r>
           </w:p>
         </w:tc>
         <w:tc>
           <w:tcPr>
-            <w:tcW w:type="dxa" w:w="2353"/>
+            <w:tcW w:type="dxa" w:w="2438"/>
           </w:tcPr>
           <w:p>
+            <w:r/>
             <w:r>
-              <w:t>知道學生「為甚麼」有興趣、興趣能否持續</w:t>
-            </w:r>
-          </w:p>
-        </w:tc>
-      </w:tr>
-      <w:tr>
-        <w:tc>
-          <w:tcPr>
-            <w:tcW w:type="dxa" w:w="2353"/>
-          </w:tcPr>
-          <w:p>
-            <w:r>
-              <w:t>補資料：加入更多 1C、1D 與「無電腦」的舊生</w:t>
-            </w:r>
-          </w:p>
-        </w:tc>
-        <w:tc>
-          <w:tcPr>
-            <w:tcW w:type="dxa" w:w="2353"/>
-          </w:tcPr>
-          <w:p>
-            <w:r>
-              <w:t>被遺漏的班別與沒有電腦的學生</w:t>
-            </w:r>
-          </w:p>
-        </w:tc>
-        <w:tc>
-          <w:tcPr>
-            <w:tcW w:type="dxa" w:w="2353"/>
-          </w:tcPr>
-          <w:p>
-            <w:r>
-              <w:t>補資料需時，短期內系統仍會錯；也可能把某一班的個別情況當成全班</w:t>
-            </w:r>
-          </w:p>
-        </w:tc>
-        <w:tc>
-          <w:tcPr>
-            <w:tcW w:type="dxa" w:w="2353"/>
-          </w:tcPr>
-          <w:p>
-            <w:r>
-              <w:t>保證新資料本身沒有新的偏斜</w:t>
-            </w:r>
-          </w:p>
-        </w:tc>
-      </w:tr>
-      <w:tr>
-        <w:tc>
-          <w:tcPr>
-            <w:tcW w:type="dxa" w:w="2353"/>
-          </w:tcPr>
-          <w:p>
-            <w:r>
-              <w:t>加人工覆核：凡「不推薦」都由老師與學生傾談</w:t>
-            </w:r>
-          </w:p>
-        </w:tc>
-        <w:tc>
-          <w:tcPr>
-            <w:tcW w:type="dxa" w:w="2353"/>
-          </w:tcPr>
-          <w:p>
-            <w:r>
-              <w:t>被系統錯誤拒絕的學生</w:t>
-            </w:r>
-          </w:p>
-        </w:tc>
-        <w:tc>
-          <w:tcPr>
-            <w:tcW w:type="dxa" w:w="2353"/>
-          </w:tcPr>
-          <w:p>
-            <w:r>
-              <w:t>老師時間有限，覆核可能排後</w:t>
-            </w:r>
-          </w:p>
-        </w:tc>
-        <w:tc>
-          <w:tcPr>
-            <w:tcW w:type="dxa" w:w="2353"/>
-          </w:tcPr>
-          <w:p>
-            <w:r>
-              <w:t>完全消除人的偏見（人也有偏見）</w:t>
+              <w:rPr>
+                <w:sz w:val="19"/>
+              </w:rPr>
+              <w:t>不知道學生為甚麼想參加，也不知道這份興趣會不會持續；這條規則只看見出席次數。</w:t>
             </w:r>
           </w:p>
         </w:tc>
@@ -1702,7 +2495,7 @@
     </w:tbl>
     <w:p>
       <w:r>
-        <w:t>好答案的判準：有「改動」＋「幫到誰」＋「可能不利於誰」＋「一件仍做不到的事」四項，其中「仍做不到」要具體。只寫「改得公平一點」而說不出代價，屬未達標。</w:t>
+        <w:t>這一列為甚麼算達標：四格都有具體內容；「不利於誰」講得出是哪一種學生、為甚麼被擋；「仍做不到」講的是這條規則本身看不見的東西（動機與持續），而不是「要再做好一點」。</w:t>
       </w:r>
     </w:p>
     <w:p>
@@ -1710,7 +2503,7 @@
         <w:pStyle w:val="Heading2"/>
       </w:pPr>
       <w:r>
-        <w:t>發行說明：評分指引</w:t>
+        <w:t>任務三：未達標對照</w:t>
       </w:r>
     </w:p>
     <w:tbl>
@@ -1720,35 +2513,69 @@
         <w:tblLook w:firstColumn="1" w:firstRow="1" w:lastColumn="0" w:lastRow="0" w:noHBand="0" w:noVBand="1" w:val="04A0"/>
       </w:tblPr>
       <w:tblGrid>
-        <w:gridCol w:w="4706"/>
-        <w:gridCol w:w="4706"/>
+        <w:gridCol w:w="2409"/>
+        <w:gridCol w:w="2409"/>
+        <w:gridCol w:w="2409"/>
+        <w:gridCol w:w="2409"/>
       </w:tblGrid>
       <w:tr>
         <w:tc>
           <w:tcPr>
-            <w:tcW w:type="dxa" w:w="4706"/>
+            <w:tcW w:type="dxa" w:w="2381"/>
           </w:tcPr>
           <w:p>
             <w:r/>
             <w:r>
               <w:rPr>
                 <w:b/>
+                <w:sz w:val="19"/>
               </w:rPr>
-              <w:t>程度</w:t>
+              <w:t>改動</w:t>
             </w:r>
           </w:p>
         </w:tc>
         <w:tc>
           <w:tcPr>
-            <w:tcW w:type="dxa" w:w="4706"/>
+            <w:tcW w:type="dxa" w:w="2381"/>
           </w:tcPr>
           <w:p>
             <w:r/>
             <w:r>
               <w:rPr>
                 <w:b/>
+                <w:sz w:val="19"/>
               </w:rPr>
-              <w:t>表現</w:t>
+              <w:t>幫到誰</w:t>
+            </w:r>
+          </w:p>
+        </w:tc>
+        <w:tc>
+          <w:tcPr>
+            <w:tcW w:type="dxa" w:w="2438"/>
+          </w:tcPr>
+          <w:p>
+            <w:r/>
+            <w:r>
+              <w:rPr>
+                <w:b/>
+                <w:sz w:val="19"/>
+              </w:rPr>
+              <w:t>可能不利於誰</w:t>
+            </w:r>
+          </w:p>
+        </w:tc>
+        <w:tc>
+          <w:tcPr>
+            <w:tcW w:type="dxa" w:w="2438"/>
+          </w:tcPr>
+          <w:p>
+            <w:r/>
+            <w:r>
+              <w:rPr>
+                <w:b/>
+                <w:sz w:val="19"/>
+              </w:rPr>
+              <w:t>仍做不到甚麼</w:t>
             </w:r>
           </w:p>
         </w:tc>
@@ -1756,21 +2583,224 @@
       <w:tr>
         <w:tc>
           <w:tcPr>
-            <w:tcW w:type="dxa" w:w="4706"/>
+            <w:tcW w:type="dxa" w:w="2381"/>
           </w:tcPr>
           <w:p>
+            <w:r/>
             <w:r>
-              <w:t>強</w:t>
+              <w:rPr>
+                <w:sz w:val="19"/>
+              </w:rPr>
+              <w:t>把規則改好一點，令它公平些。</w:t>
             </w:r>
           </w:p>
         </w:tc>
         <w:tc>
           <w:tcPr>
-            <w:tcW w:type="dxa" w:w="4706"/>
+            <w:tcW w:type="dxa" w:w="2381"/>
           </w:tcPr>
           <w:p>
+            <w:r/>
             <w:r>
-              <w:t>四部分齊全且具體：「可用於」有實例；「不可用於」點出具體傷害；「真人必須看」有觸發點。</w:t>
+              <w:rPr>
+                <w:sz w:val="19"/>
+              </w:rPr>
+              <w:t>所有學生。</w:t>
+            </w:r>
+          </w:p>
+        </w:tc>
+        <w:tc>
+          <w:tcPr>
+            <w:tcW w:type="dxa" w:w="2438"/>
+          </w:tcPr>
+          <w:p>
+            <w:r/>
+            <w:r>
+              <w:rPr>
+                <w:sz w:val="19"/>
+              </w:rPr>
+              <w:t>可能有些人不開心。</w:t>
+            </w:r>
+          </w:p>
+        </w:tc>
+        <w:tc>
+          <w:tcPr>
+            <w:tcW w:type="dxa" w:w="2438"/>
+          </w:tcPr>
+          <w:p>
+            <w:r/>
+            <w:r>
+              <w:rPr>
+                <w:sz w:val="19"/>
+              </w:rPr>
+              <w:t>要再做好一點。</w:t>
+            </w:r>
+          </w:p>
+        </w:tc>
+      </w:tr>
+    </w:tbl>
+    <w:p>
+      <w:r>
+        <w:t>缺了甚麼：四格之中，沒有一格可以查證。「公平些」是哪一行改成甚麼？「所有學生」即沒有幫到任何特定的人；「有些人不開心」是誰、為甚麼；「要再做好一點」不是一件做不到的事，是一句願望。判分：未達標——四格實質為零格。</w:t>
+      </w:r>
+    </w:p>
+    <w:p>
+      <w:r>
+        <w:br w:type="page"/>
+      </w:r>
+    </w:p>
+    <w:p>
+      <w:pPr>
+        <w:pStyle w:val="Heading2"/>
+      </w:pPr>
+      <w:r>
+        <w:t>三份作品原文判分</w:t>
+      </w:r>
+    </w:p>
+    <w:p>
+      <w:r>
+        <w:t>以下三份是學生原文（只改錯字，保留原話），連發行說明一併判。教師可以先自己判一次，再對照後面的判斷。</w:t>
+      </w:r>
+    </w:p>
+    <w:p>
+      <w:pPr>
+        <w:pStyle w:val="Heading3"/>
+      </w:pPr>
+      <w:r>
+        <w:t>作品一</w:t>
+      </w:r>
+    </w:p>
+    <w:p>
+      <w:r>
+        <w:t>我把第 1 行改成「出席節數 ≥ 1」。這幫到好像 F 一樣沒有電腦但來過課的同學。不過未嚟過嘅同學仲係會被擋，例如病咗整個學期嗰位。系統仍然唔知佢哋係唔係真的有興趣。</w:t>
+      </w:r>
+    </w:p>
+    <w:p>
+      <w:r>
+        <w:t>發行說明：這個系統只可以用來提示老師「邊個同學可能想試堂」。它不可以用來決定邊個唔准參加。如果系統話唔推薦，但老師知道那位同學很有興趣，就要由老師親自和學生傾。</w:t>
+      </w:r>
+    </w:p>
+    <w:p>
+      <w:r>
+        <w:t>判分：達標。理由：改動寫明改哪一行、改成甚麼；「幫到誰」有具體人（F）；「不利於誰」講出一個真實情況（病了一個學期）；發行說明三句齊——一個用途、一條禁令、一個「真人必須看」的觸發點。</w:t>
+      </w:r>
+    </w:p>
+    <w:p>
+      <w:pPr>
+        <w:pStyle w:val="Heading3"/>
+      </w:pPr>
+      <w:r>
+        <w:t>作品二</w:t>
+      </w:r>
+    </w:p>
+    <w:p>
+      <w:r>
+        <w:t>我把第 1 行改成出席節數 ≥ 1，這樣沒有電腦的同學也有機會。可能會令一些同學不開心。</w:t>
+      </w:r>
+    </w:p>
+    <w:p>
+      <w:r>
+        <w:t>發行說明：這個系統可以用來幫老師選同學參加編程學會，但要小心使用，最好由老師再看一次。</w:t>
+      </w:r>
+    </w:p>
+    <w:p>
+      <w:r>
+        <w:t>判分：發展中。理由：改動具體（有）；「不利於誰」空泛——「一些同學」是誰、為甚麼不開心，說不出來（缺）；「仍做不到」沒有寫（缺）；發行說明有用途，但「小心使用」「最好再看一次」說不出觸發點（半）。</w:t>
+      </w:r>
+    </w:p>
+    <w:p>
+      <w:pPr>
+        <w:pStyle w:val="Heading3"/>
+      </w:pPr>
+      <w:r>
+        <w:t>作品三</w:t>
+      </w:r>
+    </w:p>
+    <w:p>
+      <w:r>
+        <w:t>我改咗規則，現在公平好多，AI 唔會再有偏見。</w:t>
+      </w:r>
+    </w:p>
+    <w:p>
+      <w:r>
+        <w:t>發行說明：這個系統很好，可以幫老師。</w:t>
+      </w:r>
+    </w:p>
+    <w:p>
+      <w:r>
+        <w:t>判分：需要協助。理由：沒有寫改哪一行、改成甚麼；幫到誰／不利於誰／仍做不到三格全空；「AI 唔會再有偏見」是不成立的結論——規則由人寫，人仍然有偏見；發行說明沒有用途界限。</w:t>
+      </w:r>
+    </w:p>
+    <w:tbl>
+      <w:tblPr>
+        <w:tblStyle w:val="TableGrid"/>
+        <w:tblW w:type="auto" w:w="0"/>
+        <w:tblLook w:firstColumn="1" w:firstRow="1" w:lastColumn="0" w:lastRow="0" w:noHBand="0" w:noVBand="1" w:val="04A0"/>
+      </w:tblPr>
+      <w:tblGrid>
+        <w:gridCol w:w="2409"/>
+        <w:gridCol w:w="2409"/>
+        <w:gridCol w:w="2409"/>
+        <w:gridCol w:w="2409"/>
+      </w:tblGrid>
+      <w:tr>
+        <w:tc>
+          <w:tcPr>
+            <w:tcW w:type="dxa" w:w="1020"/>
+          </w:tcPr>
+          <w:p>
+            <w:r/>
+            <w:r>
+              <w:rPr>
+                <w:b/>
+                <w:sz w:val="19"/>
+              </w:rPr>
+              <w:t>作品</w:t>
+            </w:r>
+          </w:p>
+        </w:tc>
+        <w:tc>
+          <w:tcPr>
+            <w:tcW w:type="dxa" w:w="1247"/>
+          </w:tcPr>
+          <w:p>
+            <w:r/>
+            <w:r>
+              <w:rPr>
+                <w:b/>
+                <w:sz w:val="19"/>
+              </w:rPr>
+              <w:t>判斷</w:t>
+            </w:r>
+          </w:p>
+        </w:tc>
+        <w:tc>
+          <w:tcPr>
+            <w:tcW w:type="dxa" w:w="3742"/>
+          </w:tcPr>
+          <w:p>
+            <w:r/>
+            <w:r>
+              <w:rPr>
+                <w:b/>
+                <w:sz w:val="19"/>
+              </w:rPr>
+              <w:t>一眼看到的理由</w:t>
+            </w:r>
+          </w:p>
+        </w:tc>
+        <w:tc>
+          <w:tcPr>
+            <w:tcW w:type="dxa" w:w="3345"/>
+          </w:tcPr>
+          <w:p>
+            <w:r/>
+            <w:r>
+              <w:rPr>
+                <w:b/>
+                <w:sz w:val="19"/>
+              </w:rPr>
+              <w:t>課堂跟進</w:t>
             </w:r>
           </w:p>
         </w:tc>
@@ -1778,21 +2808,57 @@
       <w:tr>
         <w:tc>
           <w:tcPr>
-            <w:tcW w:type="dxa" w:w="4706"/>
+            <w:tcW w:type="dxa" w:w="1020"/>
           </w:tcPr>
           <w:p>
+            <w:r/>
             <w:r>
-              <w:t>發展中</w:t>
+              <w:rPr>
+                <w:sz w:val="19"/>
+              </w:rPr>
+              <w:t>一</w:t>
             </w:r>
           </w:p>
         </w:tc>
         <w:tc>
           <w:tcPr>
-            <w:tcW w:type="dxa" w:w="4706"/>
+            <w:tcW w:type="dxa" w:w="1247"/>
           </w:tcPr>
           <w:p>
+            <w:r/>
             <w:r>
-              <w:t>只寫出其中兩三部分，或各部分都有但空泛（「小心使用」「有時要人看」）。</w:t>
+              <w:rPr>
+                <w:sz w:val="19"/>
+              </w:rPr>
+              <w:t>達標</w:t>
+            </w:r>
+          </w:p>
+        </w:tc>
+        <w:tc>
+          <w:tcPr>
+            <w:tcW w:type="dxa" w:w="3742"/>
+          </w:tcPr>
+          <w:p>
+            <w:r/>
+            <w:r>
+              <w:rPr>
+                <w:sz w:val="19"/>
+              </w:rPr>
+              <w:t>四格可查證；發行說明有用途、有禁令、有觸發點</w:t>
+            </w:r>
+          </w:p>
+        </w:tc>
+        <w:tc>
+          <w:tcPr>
+            <w:tcW w:type="dxa" w:w="3345"/>
+          </w:tcPr>
+          <w:p>
+            <w:r/>
+            <w:r>
+              <w:rPr>
+                <w:sz w:val="19"/>
+              </w:rPr>
+              <w:t>可作全班朗讀的示例</w:t>
             </w:r>
           </w:p>
         </w:tc>
@@ -1800,26 +2866,193 @@
       <w:tr>
         <w:tc>
           <w:tcPr>
-            <w:tcW w:type="dxa" w:w="4706"/>
+            <w:tcW w:type="dxa" w:w="1020"/>
           </w:tcPr>
           <w:p>
+            <w:r/>
             <w:r>
+              <w:rPr>
+                <w:sz w:val="19"/>
+              </w:rPr>
+              <w:t>二</w:t>
+            </w:r>
+          </w:p>
+        </w:tc>
+        <w:tc>
+          <w:tcPr>
+            <w:tcW w:type="dxa" w:w="1247"/>
+          </w:tcPr>
+          <w:p>
+            <w:r/>
+            <w:r>
+              <w:rPr>
+                <w:sz w:val="19"/>
+              </w:rPr>
+              <w:t>發展中</w:t>
+            </w:r>
+          </w:p>
+        </w:tc>
+        <w:tc>
+          <w:tcPr>
+            <w:tcW w:type="dxa" w:w="3742"/>
+          </w:tcPr>
+          <w:p>
+            <w:r/>
+            <w:r>
+              <w:rPr>
+                <w:sz w:val="19"/>
+              </w:rPr>
+              <w:t>改動具體，但「不利於誰」空泛、「仍做不到」漏了</w:t>
+            </w:r>
+          </w:p>
+        </w:tc>
+        <w:tc>
+          <w:tcPr>
+            <w:tcW w:type="dxa" w:w="3345"/>
+          </w:tcPr>
+          <w:p>
+            <w:r/>
+            <w:r>
+              <w:rPr>
+                <w:sz w:val="19"/>
+              </w:rPr>
+              <w:t>追問一句：「邊個唔開心？為咩？」</w:t>
+            </w:r>
+          </w:p>
+        </w:tc>
+      </w:tr>
+      <w:tr>
+        <w:tc>
+          <w:tcPr>
+            <w:tcW w:type="dxa" w:w="1020"/>
+          </w:tcPr>
+          <w:p>
+            <w:r/>
+            <w:r>
+              <w:rPr>
+                <w:sz w:val="19"/>
+              </w:rPr>
+              <w:t>三</w:t>
+            </w:r>
+          </w:p>
+        </w:tc>
+        <w:tc>
+          <w:tcPr>
+            <w:tcW w:type="dxa" w:w="1247"/>
+          </w:tcPr>
+          <w:p>
+            <w:r/>
+            <w:r>
+              <w:rPr>
+                <w:sz w:val="19"/>
+              </w:rPr>
               <w:t>需要協助</w:t>
             </w:r>
           </w:p>
         </w:tc>
         <w:tc>
           <w:tcPr>
-            <w:tcW w:type="dxa" w:w="4706"/>
+            <w:tcW w:type="dxa" w:w="3742"/>
           </w:tcPr>
           <w:p>
+            <w:r/>
             <w:r>
-              <w:t>只寫一句「系統現在好多了」，或只重複任務字眼，沒有用途或界限。</w:t>
+              <w:rPr>
+                <w:sz w:val="19"/>
+              </w:rPr>
+              <w:t>沒寫改哪一行；「唔會有偏見」不成立</w:t>
+            </w:r>
+          </w:p>
+        </w:tc>
+        <w:tc>
+          <w:tcPr>
+            <w:tcW w:type="dxa" w:w="3345"/>
+          </w:tcPr>
+          <w:p>
+            <w:r/>
+            <w:r>
+              <w:rPr>
+                <w:sz w:val="19"/>
+              </w:rPr>
+              <w:t>回到第 1 行，請他指著規則說出改哪一個字</w:t>
             </w:r>
           </w:p>
         </w:tc>
       </w:tr>
     </w:tbl>
+    <w:p>
+      <w:pPr>
+        <w:pStyle w:val="Heading2"/>
+      </w:pPr>
+      <w:r>
+        <w:t>教師六十秒批改流程</w:t>
+      </w:r>
+    </w:p>
+    <w:p>
+      <w:r>
+        <w:t>一份工作紙只看四格加一段發行說明，一分鐘足夠。次序是固定的：不要由第一行讀起，先看「改動」那一格，可以省下大半時間。</w:t>
+      </w:r>
+    </w:p>
+    <w:p>
+      <w:r>
+        <w:rPr>
+          <w:b/>
+        </w:rPr>
+        <w:t xml:space="preserve">1. </w:t>
+      </w:r>
+      <w:r>
+        <w:t>0–10 秒｜看「改動」。有沒有寫出「改哪一行、改成甚麼」？沒有 → 判「需要協助」，不必再看下去。</w:t>
+      </w:r>
+    </w:p>
+    <w:p>
+      <w:r>
+        <w:rPr>
+          <w:b/>
+        </w:rPr>
+        <w:t xml:space="preserve">2. </w:t>
+      </w:r>
+      <w:r>
+        <w:t>10–25 秒｜看「幫到誰」。有沒有一個可以指認的人或一類學生？「所有學生」等同未填。</w:t>
+      </w:r>
+    </w:p>
+    <w:p>
+      <w:r>
+        <w:rPr>
+          <w:b/>
+        </w:rPr>
+        <w:t xml:space="preserve">3. </w:t>
+      </w:r>
+      <w:r>
+        <w:t>25–40 秒｜看「不利於誰」與「仍做不到」。兩格都要有；「仍做不到」要講這條規則本身看不見的東西（動機、持續、家裏情況），不是「要再做好一點」。</w:t>
+      </w:r>
+    </w:p>
+    <w:p>
+      <w:r>
+        <w:rPr>
+          <w:b/>
+        </w:rPr>
+        <w:t xml:space="preserve">4. </w:t>
+      </w:r>
+      <w:r>
+        <w:t>40–50 秒｜看發行說明。找三樣東西：一個具體用途、一條具體禁令、一個「真人必須看」的觸發點。</w:t>
+      </w:r>
+    </w:p>
+    <w:p>
+      <w:r>
+        <w:rPr>
+          <w:b/>
+        </w:rPr>
+        <w:t xml:space="preserve">5. </w:t>
+      </w:r>
+      <w:r>
+        <w:t>50–60 秒｜寫一句下一步。只寫他下一次要補的一件事，例如「補上『仍做不到』：這條規則看不到學生為甚麼想參加」。不要在紙上寫長評語。</w:t>
+      </w:r>
+    </w:p>
+    <w:p>
+      <w:r>
+        <w:t>判分只有三級：四格齊全＋發行說明三樣齊全＝達標；缺一至兩樣＝發展中；「改動」那一格已經不可查證＝需要協助。</w:t>
+      </w:r>
+    </w:p>
     <w:p>
       <w:pPr>
         <w:pStyle w:val="Heading2"/>
@@ -1854,7 +3087,7 @@
     </w:p>
     <w:sectPr>
       <w:pgSz w:w="11906" w:h="16838"/>
-      <w:pgMar w:top="1134" w:right="1247" w:bottom="1134" w:left="1247" w:header="720" w:footer="720" w:gutter="0"/>
+      <w:pgMar w:top="1020" w:right="1134" w:bottom="1020" w:left="1134" w:header="720" w:footer="720" w:gutter="0"/>
       <w:cols w:space="720"/>
       <w:docGrid w:linePitch="360"/>
     </w:sectPr>
@@ -2226,7 +3459,6 @@
     <w:qFormat/>
     <w:rsid w:val="00FC693F"/>
     <w:rPr>
-      <w:rFonts w:ascii="Calibri" w:hAnsi="Calibri"/>
       <w:sz w:val="22"/>
     </w:rPr>
   </w:style>

</xml_diff>